<commit_message>
feat(Bitacora #7): Actualizacion Contrato de integracion
</commit_message>
<xml_diff>
--- a/docs/CONTRATO_DE_INTEGRACION_API_WEBSOCKETS.docx
+++ b/docs/CONTRATO_DE_INTEGRACION_API_WEBSOCKETS.docx
@@ -1946,7 +1946,20 @@
           <w:sz w:val="22"/>
           <w:szCs w:val="22"/>
         </w:rPr>
-        <w:t xml:space="preserve">Respuesta 404 Not Found (PIN inexistente): { "error": "PIN no encontrado" }</w:t>
+        <w:t xml:space="preserve">Respuesta 404 Not Found (PIN inexistente): { "code": "ROOM_NOT_FOUND", "error": "PIN no encontrado" }</w:t>
+      </w:r>
+    </w:p>
+    <w:p>
+      <w:pPr>
+        <w:spacing w:after="160"/>
+      </w:pPr>
+      <w:r>
+        <w:rPr>
+          <w:rFonts w:ascii="Calibri" w:cs="Calibri" w:eastAsia="Calibri" w:hAnsi="Calibri"/>
+          <w:sz w:val="22"/>
+          <w:szCs w:val="22"/>
+        </w:rPr>
+        <w:t xml:space="preserve">Los demás casos de error de esta ruta (nickname inválido, partida ya iniciada) y las reglas del PIN y del lobby están en el Anexo A, al final de este documento.</w:t>
       </w:r>
     </w:p>
     <w:p>
@@ -3650,6 +3663,19 @@
     </w:p>
     <w:p>
       <w:pPr>
+        <w:spacing w:after="160"/>
+      </w:pPr>
+      <w:r>
+        <w:rPr>
+          <w:rFonts w:ascii="Calibri" w:cs="Calibri" w:eastAsia="Calibri" w:hAnsi="Calibri"/>
+          <w:sz w:val="22"/>
+          <w:szCs w:val="22"/>
+        </w:rPr>
+        <w:t xml:space="preserve">Propuesta de criterio, con las reglas de la mecánica de voz: ver el Anexo B, al final de este documento.</w:t>
+      </w:r>
+    </w:p>
+    <w:p>
+      <w:pPr>
         <w:pStyle w:val="Heading1"/>
         <w:spacing w:after="200" w:before="400"/>
       </w:pPr>
@@ -3805,6 +3831,2840 @@
           <w:szCs w:val="22"/>
         </w:rPr>
         <w:t xml:space="preserve">Antes de la semana 3 (fin del Hito H2), revisen entre todos los equipos que nadie se haya desviado de este contrato.</w:t>
+      </w:r>
+    </w:p>
+    <w:p>
+      <w:pPr>
+        <w:pStyle w:val="Heading1"/>
+        <w:spacing w:after="200" w:before="400"/>
+      </w:pPr>
+      <w:r>
+        <w:rPr>
+          <w:b/>
+          <w:bCs/>
+          <w:color w:val="1F4E79"/>
+          <w:sz w:val="30"/>
+          <w:szCs w:val="30"/>
+        </w:rPr>
+        <w:t xml:space="preserve">Anexo A. Reglas del Módulo 1 (RF-01, RF-02 y RF-03)</w:t>
+      </w:r>
+    </w:p>
+    <w:p>
+      <w:pPr>
+        <w:pBdr>
+          <w:left w:val="single" w:color="BF9000" w:sz="18"/>
+        </w:pBdr>
+        <w:shd w:fill="FFF2CC" w:val="clear"/>
+        <w:spacing w:after="200" w:before="100"/>
+      </w:pPr>
+      <w:r>
+        <w:rPr>
+          <w:rFonts w:ascii="Calibri" w:cs="Calibri" w:eastAsia="Calibri" w:hAnsi="Calibri"/>
+          <w:i/>
+          <w:iCs/>
+          <w:color w:val="594100"/>
+          <w:sz w:val="21"/>
+          <w:szCs w:val="21"/>
+        </w:rPr>
+        <w:t xml:space="preserve">⚠ Estado: PROPUESTA pendiente de aprobación de los líderes de Backend y QA (hallazgo de QA registrado en la Bitácora). Los números (20 caracteres, 5 reintentos) y los códigos son valores razonables, no hechos que ya estuvieran en el Contrato: si Backend y QA cambian alguno, se edita este anexo. Hasta que se apruebe, QA no debe inventar payloads ni mensajes de error fuera de lo que aparece aquí.</w:t>
+      </w:r>
+    </w:p>
+    <w:p>
+      <w:pPr>
+        <w:pStyle w:val="Heading2"/>
+        <w:spacing w:after="150" w:before="300"/>
+      </w:pPr>
+      <w:r>
+        <w:rPr>
+          <w:b/>
+          <w:bCs/>
+          <w:color w:val="1F4E79"/>
+          <w:sz w:val="24"/>
+          <w:szCs w:val="24"/>
+        </w:rPr>
+        <w:t xml:space="preserve">A.1 Formato de error (todas las rutas REST)</w:t>
+      </w:r>
+    </w:p>
+    <w:p>
+      <w:pPr>
+        <w:spacing w:after="160"/>
+      </w:pPr>
+      <w:r>
+        <w:rPr>
+          <w:rFonts w:ascii="Calibri" w:cs="Calibri" w:eastAsia="Calibri" w:hAnsi="Calibri"/>
+          <w:sz w:val="22"/>
+          <w:szCs w:val="22"/>
+        </w:rPr>
+        <w:t xml:space="preserve">Toda respuesta de error REST usa este cuerpo. El campo error conserva el texto legible que ya usa el ejemplo del §3.2; code es una cadena estable que Frontend y QA usan para decidir qué mostrar y qué comprobar.</w:t>
+      </w:r>
+    </w:p>
+    <w:tbl>
+      <w:tblPr>
+        <w:tblW w:type="dxa" w:w="9350"/>
+      </w:tblPr>
+      <w:tblGrid>
+        <w:gridCol w:w="9350"/>
+      </w:tblGrid>
+      <w:tr>
+        <w:trPr>
+          <w:cantSplit/>
+        </w:trPr>
+        <w:tc>
+          <w:tcPr>
+            <w:tcW w:type="dxa" w:w="9350"/>
+            <w:shd w:fill="F2F2F2" w:val="clear"/>
+            <w:tcMar>
+              <w:top w:type="dxa" w:w="120"/>
+              <w:left w:type="dxa" w:w="150"/>
+              <w:bottom w:type="dxa" w:w="120"/>
+              <w:right w:type="dxa" w:w="150"/>
+            </w:tcMar>
+          </w:tcPr>
+          <w:p>
+            <w:pPr>
+              <w:spacing w:after="0"/>
+            </w:pPr>
+            <w:r>
+              <w:rPr>
+                <w:rFonts w:ascii="Consolas" w:cs="Consolas" w:eastAsia="Consolas" w:hAnsi="Consolas"/>
+                <w:sz w:val="19"/>
+                <w:szCs w:val="19"/>
+              </w:rPr>
+              <w:t xml:space="preserve">{ "code": "ROOM_NOT_FOUND", "error": "PIN no encontrado" }</w:t>
+            </w:r>
+          </w:p>
+        </w:tc>
+      </w:tr>
+    </w:tbl>
+    <w:p>
+      <w:pPr>
+        <w:spacing w:after="120"/>
+      </w:pPr>
+    </w:p>
+    <w:p>
+      <w:pPr>
+        <w:pStyle w:val="Heading2"/>
+        <w:spacing w:after="150" w:before="300"/>
+      </w:pPr>
+      <w:r>
+        <w:rPr>
+          <w:b/>
+          <w:bCs/>
+          <w:color w:val="1F4E79"/>
+          <w:sz w:val="24"/>
+          <w:szCs w:val="24"/>
+        </w:rPr>
+        <w:t xml:space="preserve">A.2 PIN (RF-01)</w:t>
+      </w:r>
+    </w:p>
+    <w:p>
+      <w:pPr>
+        <w:pStyle w:val="ListParagraph"/>
+        <w:numPr>
+          <w:ilvl w:val="0"/>
+          <w:numId w:val="2"/>
+        </w:numPr>
+        <w:spacing w:after="80"/>
+      </w:pPr>
+      <w:r>
+        <w:rPr>
+          <w:rFonts w:ascii="Calibri" w:cs="Calibri" w:eastAsia="Calibri" w:hAnsi="Calibri"/>
+          <w:sz w:val="22"/>
+          <w:szCs w:val="22"/>
+        </w:rPr>
+        <w:t xml:space="preserve">Se genera al azar entre 000000 y 999999 y se guarda como cadena de 6 dígitos con ceros a la izquierda ("000042", nunca "42").</w:t>
+      </w:r>
+    </w:p>
+    <w:p>
+      <w:pPr>
+        <w:pStyle w:val="ListParagraph"/>
+        <w:numPr>
+          <w:ilvl w:val="0"/>
+          <w:numId w:val="2"/>
+        </w:numPr>
+        <w:spacing w:after="80"/>
+      </w:pPr>
+      <w:r>
+        <w:rPr>
+          <w:rFonts w:ascii="Calibri" w:cs="Calibri" w:eastAsia="Calibri" w:hAnsi="Calibri"/>
+          <w:sz w:val="22"/>
+          <w:szCs w:val="22"/>
+        </w:rPr>
+        <w:t xml:space="preserve">Es único entre TODAS las salas, incluidas las que están en FINISHED: un PIN no se reutiliza.</w:t>
+      </w:r>
+    </w:p>
+    <w:p>
+      <w:pPr>
+        <w:pStyle w:val="ListParagraph"/>
+        <w:numPr>
+          <w:ilvl w:val="0"/>
+          <w:numId w:val="2"/>
+        </w:numPr>
+        <w:spacing w:after="80"/>
+      </w:pPr>
+      <w:r>
+        <w:rPr>
+          <w:rFonts w:ascii="Calibri" w:cs="Calibri" w:eastAsia="Calibri" w:hAnsi="Calibri"/>
+          <w:sz w:val="22"/>
+          <w:szCs w:val="22"/>
+        </w:rPr>
+        <w:t xml:space="preserve">La unicidad la garantiza la base de datos con una restricción UNIQUE sobre pin en la tabla Room, no una consulta previa del tipo "¿ya existe?", porque dos creaciones simultáneas pasarían esa consulta al mismo tiempo.</w:t>
+      </w:r>
+    </w:p>
+    <w:p>
+      <w:pPr>
+        <w:pStyle w:val="ListParagraph"/>
+        <w:numPr>
+          <w:ilvl w:val="0"/>
+          <w:numId w:val="2"/>
+        </w:numPr>
+        <w:spacing w:after="80"/>
+      </w:pPr>
+      <w:r>
+        <w:rPr>
+          <w:rFonts w:ascii="Calibri" w:cs="Calibri" w:eastAsia="Calibri" w:hAnsi="Calibri"/>
+          <w:sz w:val="22"/>
+          <w:szCs w:val="22"/>
+        </w:rPr>
+        <w:t xml:space="preserve">Si al guardar la base de datos rechaza el PIN por duplicado, Backend genera otro y reintenta, hasta 5 veces.</w:t>
+      </w:r>
+    </w:p>
+    <w:p>
+      <w:pPr>
+        <w:pStyle w:val="ListParagraph"/>
+        <w:numPr>
+          <w:ilvl w:val="0"/>
+          <w:numId w:val="2"/>
+        </w:numPr>
+        <w:spacing w:after="80"/>
+      </w:pPr>
+      <w:r>
+        <w:rPr>
+          <w:rFonts w:ascii="Calibri" w:cs="Calibri" w:eastAsia="Calibri" w:hAnsi="Calibri"/>
+          <w:sz w:val="22"/>
+          <w:szCs w:val="22"/>
+        </w:rPr>
+        <w:t xml:space="preserve">Equipo Base de Datos: la tabla Room necesita UNIQUE (pin).</w:t>
+      </w:r>
+    </w:p>
+    <w:p>
+      <w:pPr>
+        <w:pStyle w:val="Heading2"/>
+        <w:spacing w:after="150" w:before="300"/>
+      </w:pPr>
+      <w:r>
+        <w:rPr>
+          <w:b/>
+          <w:bCs/>
+          <w:color w:val="1F4E79"/>
+          <w:sz w:val="24"/>
+          <w:szCs w:val="24"/>
+        </w:rPr>
+        <w:t xml:space="preserve">A.3 POST /api/rooms/{pin}/join (RF-02)</w:t>
+      </w:r>
+    </w:p>
+    <w:p>
+      <w:pPr>
+        <w:keepNext/>
+        <w:spacing w:after="160"/>
+      </w:pPr>
+      <w:r>
+        <w:rPr>
+          <w:rFonts w:ascii="Calibri" w:cs="Calibri" w:eastAsia="Calibri" w:hAnsi="Calibri"/>
+          <w:sz w:val="22"/>
+          <w:szCs w:val="22"/>
+        </w:rPr>
+        <w:t xml:space="preserve">Backend valida en este orden y responde con el primer error que encuentre, para que QA pueda predecir qué respuesta recibe cada caso:</w:t>
+      </w:r>
+    </w:p>
+    <w:tbl>
+      <w:tblPr>
+        <w:tblW w:type="dxa" w:w="9350"/>
+        <w:tblBorders>
+          <w:top w:val="single" w:color="auto" w:sz="4"/>
+          <w:left w:val="single" w:color="auto" w:sz="4"/>
+          <w:bottom w:val="single" w:color="auto" w:sz="4"/>
+          <w:right w:val="single" w:color="auto" w:sz="4"/>
+          <w:insideH w:val="single" w:color="auto" w:sz="4"/>
+          <w:insideV w:val="single" w:color="auto" w:sz="4"/>
+        </w:tblBorders>
+      </w:tblPr>
+      <w:tblGrid>
+        <w:gridCol w:w="450"/>
+        <w:gridCol w:w="3000"/>
+        <w:gridCol w:w="700"/>
+        <w:gridCol w:w="2700"/>
+        <w:gridCol w:w="2500"/>
+      </w:tblGrid>
+      <w:tr>
+        <w:trPr>
+          <w:tblHeader/>
+        </w:trPr>
+        <w:tc>
+          <w:tcPr>
+            <w:tcW w:type="dxa" w:w="450"/>
+            <w:shd w:fill="1F4E79" w:val="clear"/>
+            <w:tcMar>
+              <w:top w:type="dxa" w:w="100"/>
+              <w:left w:type="dxa" w:w="120"/>
+              <w:bottom w:type="dxa" w:w="100"/>
+              <w:right w:type="dxa" w:w="120"/>
+            </w:tcMar>
+            <w:vAlign w:val="center"/>
+          </w:tcPr>
+          <w:p>
+            <w:r>
+              <w:rPr>
+                <w:rFonts w:ascii="Calibri" w:cs="Calibri" w:eastAsia="Calibri" w:hAnsi="Calibri"/>
+                <w:b/>
+                <w:bCs/>
+                <w:color w:val="FFFFFF"/>
+                <w:sz w:val="20"/>
+                <w:szCs w:val="20"/>
+              </w:rPr>
+              <w:t xml:space="preserve">#</w:t>
+            </w:r>
+          </w:p>
+        </w:tc>
+        <w:tc>
+          <w:tcPr>
+            <w:tcW w:type="dxa" w:w="3000"/>
+            <w:shd w:fill="1F4E79" w:val="clear"/>
+            <w:tcMar>
+              <w:top w:type="dxa" w:w="100"/>
+              <w:left w:type="dxa" w:w="120"/>
+              <w:bottom w:type="dxa" w:w="100"/>
+              <w:right w:type="dxa" w:w="120"/>
+            </w:tcMar>
+            <w:vAlign w:val="center"/>
+          </w:tcPr>
+          <w:p>
+            <w:r>
+              <w:rPr>
+                <w:rFonts w:ascii="Calibri" w:cs="Calibri" w:eastAsia="Calibri" w:hAnsi="Calibri"/>
+                <w:b/>
+                <w:bCs/>
+                <w:color w:val="FFFFFF"/>
+                <w:sz w:val="20"/>
+                <w:szCs w:val="20"/>
+              </w:rPr>
+              <w:t xml:space="preserve">Validación</w:t>
+            </w:r>
+          </w:p>
+        </w:tc>
+        <w:tc>
+          <w:tcPr>
+            <w:tcW w:type="dxa" w:w="700"/>
+            <w:shd w:fill="1F4E79" w:val="clear"/>
+            <w:tcMar>
+              <w:top w:type="dxa" w:w="100"/>
+              <w:left w:type="dxa" w:w="120"/>
+              <w:bottom w:type="dxa" w:w="100"/>
+              <w:right w:type="dxa" w:w="120"/>
+            </w:tcMar>
+            <w:vAlign w:val="center"/>
+          </w:tcPr>
+          <w:p>
+            <w:r>
+              <w:rPr>
+                <w:rFonts w:ascii="Calibri" w:cs="Calibri" w:eastAsia="Calibri" w:hAnsi="Calibri"/>
+                <w:b/>
+                <w:bCs/>
+                <w:color w:val="FFFFFF"/>
+                <w:sz w:val="20"/>
+                <w:szCs w:val="20"/>
+              </w:rPr>
+              <w:t xml:space="preserve">HTTP</w:t>
+            </w:r>
+          </w:p>
+        </w:tc>
+        <w:tc>
+          <w:tcPr>
+            <w:tcW w:type="dxa" w:w="2700"/>
+            <w:shd w:fill="1F4E79" w:val="clear"/>
+            <w:tcMar>
+              <w:top w:type="dxa" w:w="100"/>
+              <w:left w:type="dxa" w:w="120"/>
+              <w:bottom w:type="dxa" w:w="100"/>
+              <w:right w:type="dxa" w:w="120"/>
+            </w:tcMar>
+            <w:vAlign w:val="center"/>
+          </w:tcPr>
+          <w:p>
+            <w:r>
+              <w:rPr>
+                <w:rFonts w:ascii="Calibri" w:cs="Calibri" w:eastAsia="Calibri" w:hAnsi="Calibri"/>
+                <w:b/>
+                <w:bCs/>
+                <w:color w:val="FFFFFF"/>
+                <w:sz w:val="20"/>
+                <w:szCs w:val="20"/>
+              </w:rPr>
+              <w:t xml:space="preserve">code</w:t>
+            </w:r>
+          </w:p>
+        </w:tc>
+        <w:tc>
+          <w:tcPr>
+            <w:tcW w:type="dxa" w:w="2500"/>
+            <w:shd w:fill="1F4E79" w:val="clear"/>
+            <w:tcMar>
+              <w:top w:type="dxa" w:w="100"/>
+              <w:left w:type="dxa" w:w="120"/>
+              <w:bottom w:type="dxa" w:w="100"/>
+              <w:right w:type="dxa" w:w="120"/>
+            </w:tcMar>
+            <w:vAlign w:val="center"/>
+          </w:tcPr>
+          <w:p>
+            <w:r>
+              <w:rPr>
+                <w:rFonts w:ascii="Calibri" w:cs="Calibri" w:eastAsia="Calibri" w:hAnsi="Calibri"/>
+                <w:b/>
+                <w:bCs/>
+                <w:color w:val="FFFFFF"/>
+                <w:sz w:val="20"/>
+                <w:szCs w:val="20"/>
+              </w:rPr>
+              <w:t xml:space="preserve">error (mensaje exacto)</w:t>
+            </w:r>
+          </w:p>
+        </w:tc>
+      </w:tr>
+      <w:tr>
+        <w:trPr>
+          <w:cantSplit/>
+        </w:trPr>
+        <w:tc>
+          <w:tcPr>
+            <w:tcW w:type="dxa" w:w="450"/>
+            <w:tcMar>
+              <w:top w:type="dxa" w:w="100"/>
+              <w:left w:type="dxa" w:w="120"/>
+              <w:bottom w:type="dxa" w:w="100"/>
+              <w:right w:type="dxa" w:w="120"/>
+            </w:tcMar>
+            <w:vAlign w:val="center"/>
+          </w:tcPr>
+          <w:p>
+            <w:r>
+              <w:rPr>
+                <w:rFonts w:ascii="Calibri" w:cs="Calibri" w:eastAsia="Calibri" w:hAnsi="Calibri"/>
+                <w:b w:val="false"/>
+                <w:bCs w:val="false"/>
+                <w:color w:val="000000"/>
+                <w:sz w:val="20"/>
+                <w:szCs w:val="20"/>
+              </w:rPr>
+              <w:t xml:space="preserve">1</w:t>
+            </w:r>
+          </w:p>
+        </w:tc>
+        <w:tc>
+          <w:tcPr>
+            <w:tcW w:type="dxa" w:w="3000"/>
+            <w:tcMar>
+              <w:top w:type="dxa" w:w="100"/>
+              <w:left w:type="dxa" w:w="120"/>
+              <w:bottom w:type="dxa" w:w="100"/>
+              <w:right w:type="dxa" w:w="120"/>
+            </w:tcMar>
+            <w:vAlign w:val="center"/>
+          </w:tcPr>
+          <w:p>
+            <w:r>
+              <w:rPr>
+                <w:rFonts w:ascii="Calibri" w:cs="Calibri" w:eastAsia="Calibri" w:hAnsi="Calibri"/>
+                <w:b w:val="false"/>
+                <w:bCs w:val="false"/>
+                <w:color w:val="000000"/>
+                <w:sz w:val="20"/>
+                <w:szCs w:val="20"/>
+              </w:rPr>
+              <w:t xml:space="preserve">El PIN no tiene exactamente 6 dígitos.</w:t>
+            </w:r>
+          </w:p>
+        </w:tc>
+        <w:tc>
+          <w:tcPr>
+            <w:tcW w:type="dxa" w:w="700"/>
+            <w:tcMar>
+              <w:top w:type="dxa" w:w="100"/>
+              <w:left w:type="dxa" w:w="120"/>
+              <w:bottom w:type="dxa" w:w="100"/>
+              <w:right w:type="dxa" w:w="120"/>
+            </w:tcMar>
+            <w:vAlign w:val="center"/>
+          </w:tcPr>
+          <w:p>
+            <w:r>
+              <w:rPr>
+                <w:rFonts w:ascii="Calibri" w:cs="Calibri" w:eastAsia="Calibri" w:hAnsi="Calibri"/>
+                <w:b w:val="false"/>
+                <w:bCs w:val="false"/>
+                <w:color w:val="000000"/>
+                <w:sz w:val="20"/>
+                <w:szCs w:val="20"/>
+              </w:rPr>
+              <w:t xml:space="preserve">400</w:t>
+            </w:r>
+          </w:p>
+        </w:tc>
+        <w:tc>
+          <w:tcPr>
+            <w:tcW w:type="dxa" w:w="2700"/>
+            <w:tcMar>
+              <w:top w:type="dxa" w:w="100"/>
+              <w:left w:type="dxa" w:w="120"/>
+              <w:bottom w:type="dxa" w:w="100"/>
+              <w:right w:type="dxa" w:w="120"/>
+            </w:tcMar>
+            <w:vAlign w:val="center"/>
+          </w:tcPr>
+          <w:p>
+            <w:r>
+              <w:rPr>
+                <w:rFonts w:ascii="Consolas" w:cs="Consolas" w:eastAsia="Consolas" w:hAnsi="Consolas"/>
+                <w:b w:val="false"/>
+                <w:bCs w:val="false"/>
+                <w:color w:val="000000"/>
+                <w:sz w:val="19"/>
+                <w:szCs w:val="19"/>
+              </w:rPr>
+              <w:t xml:space="preserve">PIN_INVALID</w:t>
+            </w:r>
+          </w:p>
+        </w:tc>
+        <w:tc>
+          <w:tcPr>
+            <w:tcW w:type="dxa" w:w="2500"/>
+            <w:tcMar>
+              <w:top w:type="dxa" w:w="100"/>
+              <w:left w:type="dxa" w:w="120"/>
+              <w:bottom w:type="dxa" w:w="100"/>
+              <w:right w:type="dxa" w:w="120"/>
+            </w:tcMar>
+            <w:vAlign w:val="center"/>
+          </w:tcPr>
+          <w:p>
+            <w:r>
+              <w:rPr>
+                <w:rFonts w:ascii="Calibri" w:cs="Calibri" w:eastAsia="Calibri" w:hAnsi="Calibri"/>
+                <w:b w:val="false"/>
+                <w:bCs w:val="false"/>
+                <w:color w:val="000000"/>
+                <w:sz w:val="20"/>
+                <w:szCs w:val="20"/>
+              </w:rPr>
+              <w:t xml:space="preserve">El PIN debe tener 6 dígitos</w:t>
+            </w:r>
+          </w:p>
+        </w:tc>
+      </w:tr>
+      <w:tr>
+        <w:trPr>
+          <w:cantSplit/>
+        </w:trPr>
+        <w:tc>
+          <w:tcPr>
+            <w:tcW w:type="dxa" w:w="450"/>
+            <w:tcMar>
+              <w:top w:type="dxa" w:w="100"/>
+              <w:left w:type="dxa" w:w="120"/>
+              <w:bottom w:type="dxa" w:w="100"/>
+              <w:right w:type="dxa" w:w="120"/>
+            </w:tcMar>
+            <w:vAlign w:val="center"/>
+          </w:tcPr>
+          <w:p>
+            <w:r>
+              <w:rPr>
+                <w:rFonts w:ascii="Calibri" w:cs="Calibri" w:eastAsia="Calibri" w:hAnsi="Calibri"/>
+                <w:b w:val="false"/>
+                <w:bCs w:val="false"/>
+                <w:color w:val="000000"/>
+                <w:sz w:val="20"/>
+                <w:szCs w:val="20"/>
+              </w:rPr>
+              <w:t xml:space="preserve">2</w:t>
+            </w:r>
+          </w:p>
+        </w:tc>
+        <w:tc>
+          <w:tcPr>
+            <w:tcW w:type="dxa" w:w="3000"/>
+            <w:tcMar>
+              <w:top w:type="dxa" w:w="100"/>
+              <w:left w:type="dxa" w:w="120"/>
+              <w:bottom w:type="dxa" w:w="100"/>
+              <w:right w:type="dxa" w:w="120"/>
+            </w:tcMar>
+            <w:vAlign w:val="center"/>
+          </w:tcPr>
+          <w:p>
+            <w:r>
+              <w:rPr>
+                <w:rFonts w:ascii="Calibri" w:cs="Calibri" w:eastAsia="Calibri" w:hAnsi="Calibri"/>
+                <w:b w:val="false"/>
+                <w:bCs w:val="false"/>
+                <w:color w:val="000000"/>
+                <w:sz w:val="20"/>
+                <w:szCs w:val="20"/>
+              </w:rPr>
+              <w:t xml:space="preserve">No existe una sala con ese PIN.</w:t>
+            </w:r>
+          </w:p>
+        </w:tc>
+        <w:tc>
+          <w:tcPr>
+            <w:tcW w:type="dxa" w:w="700"/>
+            <w:tcMar>
+              <w:top w:type="dxa" w:w="100"/>
+              <w:left w:type="dxa" w:w="120"/>
+              <w:bottom w:type="dxa" w:w="100"/>
+              <w:right w:type="dxa" w:w="120"/>
+            </w:tcMar>
+            <w:vAlign w:val="center"/>
+          </w:tcPr>
+          <w:p>
+            <w:r>
+              <w:rPr>
+                <w:rFonts w:ascii="Calibri" w:cs="Calibri" w:eastAsia="Calibri" w:hAnsi="Calibri"/>
+                <w:b w:val="false"/>
+                <w:bCs w:val="false"/>
+                <w:color w:val="000000"/>
+                <w:sz w:val="20"/>
+                <w:szCs w:val="20"/>
+              </w:rPr>
+              <w:t xml:space="preserve">404</w:t>
+            </w:r>
+          </w:p>
+        </w:tc>
+        <w:tc>
+          <w:tcPr>
+            <w:tcW w:type="dxa" w:w="2700"/>
+            <w:tcMar>
+              <w:top w:type="dxa" w:w="100"/>
+              <w:left w:type="dxa" w:w="120"/>
+              <w:bottom w:type="dxa" w:w="100"/>
+              <w:right w:type="dxa" w:w="120"/>
+            </w:tcMar>
+            <w:vAlign w:val="center"/>
+          </w:tcPr>
+          <w:p>
+            <w:r>
+              <w:rPr>
+                <w:rFonts w:ascii="Consolas" w:cs="Consolas" w:eastAsia="Consolas" w:hAnsi="Consolas"/>
+                <w:b w:val="false"/>
+                <w:bCs w:val="false"/>
+                <w:color w:val="000000"/>
+                <w:sz w:val="19"/>
+                <w:szCs w:val="19"/>
+              </w:rPr>
+              <w:t xml:space="preserve">ROOM_NOT_FOUND</w:t>
+            </w:r>
+          </w:p>
+        </w:tc>
+        <w:tc>
+          <w:tcPr>
+            <w:tcW w:type="dxa" w:w="2500"/>
+            <w:tcMar>
+              <w:top w:type="dxa" w:w="100"/>
+              <w:left w:type="dxa" w:w="120"/>
+              <w:bottom w:type="dxa" w:w="100"/>
+              <w:right w:type="dxa" w:w="120"/>
+            </w:tcMar>
+            <w:vAlign w:val="center"/>
+          </w:tcPr>
+          <w:p>
+            <w:r>
+              <w:rPr>
+                <w:rFonts w:ascii="Calibri" w:cs="Calibri" w:eastAsia="Calibri" w:hAnsi="Calibri"/>
+                <w:b w:val="false"/>
+                <w:bCs w:val="false"/>
+                <w:color w:val="000000"/>
+                <w:sz w:val="20"/>
+                <w:szCs w:val="20"/>
+              </w:rPr>
+              <w:t xml:space="preserve">PIN no encontrado</w:t>
+            </w:r>
+          </w:p>
+        </w:tc>
+      </w:tr>
+      <w:tr>
+        <w:trPr>
+          <w:cantSplit/>
+        </w:trPr>
+        <w:tc>
+          <w:tcPr>
+            <w:tcW w:type="dxa" w:w="450"/>
+            <w:tcMar>
+              <w:top w:type="dxa" w:w="100"/>
+              <w:left w:type="dxa" w:w="120"/>
+              <w:bottom w:type="dxa" w:w="100"/>
+              <w:right w:type="dxa" w:w="120"/>
+            </w:tcMar>
+            <w:vAlign w:val="center"/>
+          </w:tcPr>
+          <w:p>
+            <w:r>
+              <w:rPr>
+                <w:rFonts w:ascii="Calibri" w:cs="Calibri" w:eastAsia="Calibri" w:hAnsi="Calibri"/>
+                <w:b w:val="false"/>
+                <w:bCs w:val="false"/>
+                <w:color w:val="000000"/>
+                <w:sz w:val="20"/>
+                <w:szCs w:val="20"/>
+              </w:rPr>
+              <w:t xml:space="preserve">3</w:t>
+            </w:r>
+          </w:p>
+        </w:tc>
+        <w:tc>
+          <w:tcPr>
+            <w:tcW w:type="dxa" w:w="3000"/>
+            <w:tcMar>
+              <w:top w:type="dxa" w:w="100"/>
+              <w:left w:type="dxa" w:w="120"/>
+              <w:bottom w:type="dxa" w:w="100"/>
+              <w:right w:type="dxa" w:w="120"/>
+            </w:tcMar>
+            <w:vAlign w:val="center"/>
+          </w:tcPr>
+          <w:p>
+            <w:r>
+              <w:rPr>
+                <w:rFonts w:ascii="Calibri" w:cs="Calibri" w:eastAsia="Calibri" w:hAnsi="Calibri"/>
+                <w:b w:val="false"/>
+                <w:bCs w:val="false"/>
+                <w:color w:val="000000"/>
+                <w:sz w:val="20"/>
+                <w:szCs w:val="20"/>
+              </w:rPr>
+              <w:t xml:space="preserve">La sala no está en WAITING_LOBBY (la partida ya comenzó o terminó).</w:t>
+            </w:r>
+          </w:p>
+        </w:tc>
+        <w:tc>
+          <w:tcPr>
+            <w:tcW w:type="dxa" w:w="700"/>
+            <w:tcMar>
+              <w:top w:type="dxa" w:w="100"/>
+              <w:left w:type="dxa" w:w="120"/>
+              <w:bottom w:type="dxa" w:w="100"/>
+              <w:right w:type="dxa" w:w="120"/>
+            </w:tcMar>
+            <w:vAlign w:val="center"/>
+          </w:tcPr>
+          <w:p>
+            <w:r>
+              <w:rPr>
+                <w:rFonts w:ascii="Calibri" w:cs="Calibri" w:eastAsia="Calibri" w:hAnsi="Calibri"/>
+                <w:b w:val="false"/>
+                <w:bCs w:val="false"/>
+                <w:color w:val="000000"/>
+                <w:sz w:val="20"/>
+                <w:szCs w:val="20"/>
+              </w:rPr>
+              <w:t xml:space="preserve">409</w:t>
+            </w:r>
+          </w:p>
+        </w:tc>
+        <w:tc>
+          <w:tcPr>
+            <w:tcW w:type="dxa" w:w="2700"/>
+            <w:tcMar>
+              <w:top w:type="dxa" w:w="100"/>
+              <w:left w:type="dxa" w:w="120"/>
+              <w:bottom w:type="dxa" w:w="100"/>
+              <w:right w:type="dxa" w:w="120"/>
+            </w:tcMar>
+            <w:vAlign w:val="center"/>
+          </w:tcPr>
+          <w:p>
+            <w:r>
+              <w:rPr>
+                <w:rFonts w:ascii="Consolas" w:cs="Consolas" w:eastAsia="Consolas" w:hAnsi="Consolas"/>
+                <w:b w:val="false"/>
+                <w:bCs w:val="false"/>
+                <w:color w:val="000000"/>
+                <w:sz w:val="19"/>
+                <w:szCs w:val="19"/>
+              </w:rPr>
+              <w:t xml:space="preserve">ROOM_ALREADY_STARTED</w:t>
+            </w:r>
+          </w:p>
+        </w:tc>
+        <w:tc>
+          <w:tcPr>
+            <w:tcW w:type="dxa" w:w="2500"/>
+            <w:tcMar>
+              <w:top w:type="dxa" w:w="100"/>
+              <w:left w:type="dxa" w:w="120"/>
+              <w:bottom w:type="dxa" w:w="100"/>
+              <w:right w:type="dxa" w:w="120"/>
+            </w:tcMar>
+            <w:vAlign w:val="center"/>
+          </w:tcPr>
+          <w:p>
+            <w:r>
+              <w:rPr>
+                <w:rFonts w:ascii="Calibri" w:cs="Calibri" w:eastAsia="Calibri" w:hAnsi="Calibri"/>
+                <w:b w:val="false"/>
+                <w:bCs w:val="false"/>
+                <w:color w:val="000000"/>
+                <w:sz w:val="20"/>
+                <w:szCs w:val="20"/>
+              </w:rPr>
+              <w:t xml:space="preserve">La partida ya comenzó</w:t>
+            </w:r>
+          </w:p>
+        </w:tc>
+      </w:tr>
+      <w:tr>
+        <w:trPr>
+          <w:cantSplit/>
+        </w:trPr>
+        <w:tc>
+          <w:tcPr>
+            <w:tcW w:type="dxa" w:w="450"/>
+            <w:tcMar>
+              <w:top w:type="dxa" w:w="100"/>
+              <w:left w:type="dxa" w:w="120"/>
+              <w:bottom w:type="dxa" w:w="100"/>
+              <w:right w:type="dxa" w:w="120"/>
+            </w:tcMar>
+            <w:vAlign w:val="center"/>
+          </w:tcPr>
+          <w:p>
+            <w:r>
+              <w:rPr>
+                <w:rFonts w:ascii="Calibri" w:cs="Calibri" w:eastAsia="Calibri" w:hAnsi="Calibri"/>
+                <w:b w:val="false"/>
+                <w:bCs w:val="false"/>
+                <w:color w:val="000000"/>
+                <w:sz w:val="20"/>
+                <w:szCs w:val="20"/>
+              </w:rPr>
+              <w:t xml:space="preserve">4</w:t>
+            </w:r>
+          </w:p>
+        </w:tc>
+        <w:tc>
+          <w:tcPr>
+            <w:tcW w:type="dxa" w:w="3000"/>
+            <w:tcMar>
+              <w:top w:type="dxa" w:w="100"/>
+              <w:left w:type="dxa" w:w="120"/>
+              <w:bottom w:type="dxa" w:w="100"/>
+              <w:right w:type="dxa" w:w="120"/>
+            </w:tcMar>
+            <w:vAlign w:val="center"/>
+          </w:tcPr>
+          <w:p>
+            <w:r>
+              <w:rPr>
+                <w:rFonts w:ascii="Calibri" w:cs="Calibri" w:eastAsia="Calibri" w:hAnsi="Calibri"/>
+                <w:b w:val="false"/>
+                <w:bCs w:val="false"/>
+                <w:color w:val="000000"/>
+                <w:sz w:val="20"/>
+                <w:szCs w:val="20"/>
+              </w:rPr>
+              <w:t xml:space="preserve">El nickname está vacío o solo tiene espacios.</w:t>
+            </w:r>
+          </w:p>
+        </w:tc>
+        <w:tc>
+          <w:tcPr>
+            <w:tcW w:type="dxa" w:w="700"/>
+            <w:tcMar>
+              <w:top w:type="dxa" w:w="100"/>
+              <w:left w:type="dxa" w:w="120"/>
+              <w:bottom w:type="dxa" w:w="100"/>
+              <w:right w:type="dxa" w:w="120"/>
+            </w:tcMar>
+            <w:vAlign w:val="center"/>
+          </w:tcPr>
+          <w:p>
+            <w:r>
+              <w:rPr>
+                <w:rFonts w:ascii="Calibri" w:cs="Calibri" w:eastAsia="Calibri" w:hAnsi="Calibri"/>
+                <w:b w:val="false"/>
+                <w:bCs w:val="false"/>
+                <w:color w:val="000000"/>
+                <w:sz w:val="20"/>
+                <w:szCs w:val="20"/>
+              </w:rPr>
+              <w:t xml:space="preserve">400</w:t>
+            </w:r>
+          </w:p>
+        </w:tc>
+        <w:tc>
+          <w:tcPr>
+            <w:tcW w:type="dxa" w:w="2700"/>
+            <w:tcMar>
+              <w:top w:type="dxa" w:w="100"/>
+              <w:left w:type="dxa" w:w="120"/>
+              <w:bottom w:type="dxa" w:w="100"/>
+              <w:right w:type="dxa" w:w="120"/>
+            </w:tcMar>
+            <w:vAlign w:val="center"/>
+          </w:tcPr>
+          <w:p>
+            <w:r>
+              <w:rPr>
+                <w:rFonts w:ascii="Consolas" w:cs="Consolas" w:eastAsia="Consolas" w:hAnsi="Consolas"/>
+                <w:b w:val="false"/>
+                <w:bCs w:val="false"/>
+                <w:color w:val="000000"/>
+                <w:sz w:val="19"/>
+                <w:szCs w:val="19"/>
+              </w:rPr>
+              <w:t xml:space="preserve">NICKNAME_EMPTY</w:t>
+            </w:r>
+          </w:p>
+        </w:tc>
+        <w:tc>
+          <w:tcPr>
+            <w:tcW w:type="dxa" w:w="2500"/>
+            <w:tcMar>
+              <w:top w:type="dxa" w:w="100"/>
+              <w:left w:type="dxa" w:w="120"/>
+              <w:bottom w:type="dxa" w:w="100"/>
+              <w:right w:type="dxa" w:w="120"/>
+            </w:tcMar>
+            <w:vAlign w:val="center"/>
+          </w:tcPr>
+          <w:p>
+            <w:r>
+              <w:rPr>
+                <w:rFonts w:ascii="Calibri" w:cs="Calibri" w:eastAsia="Calibri" w:hAnsi="Calibri"/>
+                <w:b w:val="false"/>
+                <w:bCs w:val="false"/>
+                <w:color w:val="000000"/>
+                <w:sz w:val="20"/>
+                <w:szCs w:val="20"/>
+              </w:rPr>
+              <w:t xml:space="preserve">El nickname no puede estar vacío</w:t>
+            </w:r>
+          </w:p>
+        </w:tc>
+      </w:tr>
+      <w:tr>
+        <w:trPr>
+          <w:cantSplit/>
+        </w:trPr>
+        <w:tc>
+          <w:tcPr>
+            <w:tcW w:type="dxa" w:w="450"/>
+            <w:tcMar>
+              <w:top w:type="dxa" w:w="100"/>
+              <w:left w:type="dxa" w:w="120"/>
+              <w:bottom w:type="dxa" w:w="100"/>
+              <w:right w:type="dxa" w:w="120"/>
+            </w:tcMar>
+            <w:vAlign w:val="center"/>
+          </w:tcPr>
+          <w:p>
+            <w:r>
+              <w:rPr>
+                <w:rFonts w:ascii="Calibri" w:cs="Calibri" w:eastAsia="Calibri" w:hAnsi="Calibri"/>
+                <w:b w:val="false"/>
+                <w:bCs w:val="false"/>
+                <w:color w:val="000000"/>
+                <w:sz w:val="20"/>
+                <w:szCs w:val="20"/>
+              </w:rPr>
+              <w:t xml:space="preserve">5</w:t>
+            </w:r>
+          </w:p>
+        </w:tc>
+        <w:tc>
+          <w:tcPr>
+            <w:tcW w:type="dxa" w:w="3000"/>
+            <w:tcMar>
+              <w:top w:type="dxa" w:w="100"/>
+              <w:left w:type="dxa" w:w="120"/>
+              <w:bottom w:type="dxa" w:w="100"/>
+              <w:right w:type="dxa" w:w="120"/>
+            </w:tcMar>
+            <w:vAlign w:val="center"/>
+          </w:tcPr>
+          <w:p>
+            <w:r>
+              <w:rPr>
+                <w:rFonts w:ascii="Calibri" w:cs="Calibri" w:eastAsia="Calibri" w:hAnsi="Calibri"/>
+                <w:b w:val="false"/>
+                <w:bCs w:val="false"/>
+                <w:color w:val="000000"/>
+                <w:sz w:val="20"/>
+                <w:szCs w:val="20"/>
+              </w:rPr>
+              <w:t xml:space="preserve">El nickname tiene más de 20 caracteres.</w:t>
+            </w:r>
+          </w:p>
+        </w:tc>
+        <w:tc>
+          <w:tcPr>
+            <w:tcW w:type="dxa" w:w="700"/>
+            <w:tcMar>
+              <w:top w:type="dxa" w:w="100"/>
+              <w:left w:type="dxa" w:w="120"/>
+              <w:bottom w:type="dxa" w:w="100"/>
+              <w:right w:type="dxa" w:w="120"/>
+            </w:tcMar>
+            <w:vAlign w:val="center"/>
+          </w:tcPr>
+          <w:p>
+            <w:r>
+              <w:rPr>
+                <w:rFonts w:ascii="Calibri" w:cs="Calibri" w:eastAsia="Calibri" w:hAnsi="Calibri"/>
+                <w:b w:val="false"/>
+                <w:bCs w:val="false"/>
+                <w:color w:val="000000"/>
+                <w:sz w:val="20"/>
+                <w:szCs w:val="20"/>
+              </w:rPr>
+              <w:t xml:space="preserve">400</w:t>
+            </w:r>
+          </w:p>
+        </w:tc>
+        <w:tc>
+          <w:tcPr>
+            <w:tcW w:type="dxa" w:w="2700"/>
+            <w:tcMar>
+              <w:top w:type="dxa" w:w="100"/>
+              <w:left w:type="dxa" w:w="120"/>
+              <w:bottom w:type="dxa" w:w="100"/>
+              <w:right w:type="dxa" w:w="120"/>
+            </w:tcMar>
+            <w:vAlign w:val="center"/>
+          </w:tcPr>
+          <w:p>
+            <w:r>
+              <w:rPr>
+                <w:rFonts w:ascii="Consolas" w:cs="Consolas" w:eastAsia="Consolas" w:hAnsi="Consolas"/>
+                <w:b w:val="false"/>
+                <w:bCs w:val="false"/>
+                <w:color w:val="000000"/>
+                <w:sz w:val="19"/>
+                <w:szCs w:val="19"/>
+              </w:rPr>
+              <w:t xml:space="preserve">NICKNAME_TOO_LONG</w:t>
+            </w:r>
+          </w:p>
+        </w:tc>
+        <w:tc>
+          <w:tcPr>
+            <w:tcW w:type="dxa" w:w="2500"/>
+            <w:tcMar>
+              <w:top w:type="dxa" w:w="100"/>
+              <w:left w:type="dxa" w:w="120"/>
+              <w:bottom w:type="dxa" w:w="100"/>
+              <w:right w:type="dxa" w:w="120"/>
+            </w:tcMar>
+            <w:vAlign w:val="center"/>
+          </w:tcPr>
+          <w:p>
+            <w:r>
+              <w:rPr>
+                <w:rFonts w:ascii="Calibri" w:cs="Calibri" w:eastAsia="Calibri" w:hAnsi="Calibri"/>
+                <w:b w:val="false"/>
+                <w:bCs w:val="false"/>
+                <w:color w:val="000000"/>
+                <w:sz w:val="20"/>
+                <w:szCs w:val="20"/>
+              </w:rPr>
+              <w:t xml:space="preserve">El nickname no puede superar 20 caracteres</w:t>
+            </w:r>
+          </w:p>
+        </w:tc>
+      </w:tr>
+      <w:tr>
+        <w:trPr>
+          <w:cantSplit/>
+        </w:trPr>
+        <w:tc>
+          <w:tcPr>
+            <w:tcW w:type="dxa" w:w="450"/>
+            <w:tcMar>
+              <w:top w:type="dxa" w:w="100"/>
+              <w:left w:type="dxa" w:w="120"/>
+              <w:bottom w:type="dxa" w:w="100"/>
+              <w:right w:type="dxa" w:w="120"/>
+            </w:tcMar>
+            <w:vAlign w:val="center"/>
+          </w:tcPr>
+          <w:p>
+            <w:r>
+              <w:rPr>
+                <w:rFonts w:ascii="Calibri" w:cs="Calibri" w:eastAsia="Calibri" w:hAnsi="Calibri"/>
+                <w:b w:val="false"/>
+                <w:bCs w:val="false"/>
+                <w:color w:val="000000"/>
+                <w:sz w:val="20"/>
+                <w:szCs w:val="20"/>
+              </w:rPr>
+              <w:t xml:space="preserve">6</w:t>
+            </w:r>
+          </w:p>
+        </w:tc>
+        <w:tc>
+          <w:tcPr>
+            <w:tcW w:type="dxa" w:w="3000"/>
+            <w:tcMar>
+              <w:top w:type="dxa" w:w="100"/>
+              <w:left w:type="dxa" w:w="120"/>
+              <w:bottom w:type="dxa" w:w="100"/>
+              <w:right w:type="dxa" w:w="120"/>
+            </w:tcMar>
+            <w:vAlign w:val="center"/>
+          </w:tcPr>
+          <w:p>
+            <w:r>
+              <w:rPr>
+                <w:rFonts w:ascii="Calibri" w:cs="Calibri" w:eastAsia="Calibri" w:hAnsi="Calibri"/>
+                <w:b w:val="false"/>
+                <w:bCs w:val="false"/>
+                <w:color w:val="000000"/>
+                <w:sz w:val="20"/>
+                <w:szCs w:val="20"/>
+              </w:rPr>
+              <w:t xml:space="preserve">Ya hay un jugador con ese nickname en la sala, sin distinguir mayúsculas.</w:t>
+            </w:r>
+          </w:p>
+        </w:tc>
+        <w:tc>
+          <w:tcPr>
+            <w:tcW w:type="dxa" w:w="700"/>
+            <w:tcMar>
+              <w:top w:type="dxa" w:w="100"/>
+              <w:left w:type="dxa" w:w="120"/>
+              <w:bottom w:type="dxa" w:w="100"/>
+              <w:right w:type="dxa" w:w="120"/>
+            </w:tcMar>
+            <w:vAlign w:val="center"/>
+          </w:tcPr>
+          <w:p>
+            <w:r>
+              <w:rPr>
+                <w:rFonts w:ascii="Calibri" w:cs="Calibri" w:eastAsia="Calibri" w:hAnsi="Calibri"/>
+                <w:b w:val="false"/>
+                <w:bCs w:val="false"/>
+                <w:color w:val="000000"/>
+                <w:sz w:val="20"/>
+                <w:szCs w:val="20"/>
+              </w:rPr>
+              <w:t xml:space="preserve">409</w:t>
+            </w:r>
+          </w:p>
+        </w:tc>
+        <w:tc>
+          <w:tcPr>
+            <w:tcW w:type="dxa" w:w="2700"/>
+            <w:tcMar>
+              <w:top w:type="dxa" w:w="100"/>
+              <w:left w:type="dxa" w:w="120"/>
+              <w:bottom w:type="dxa" w:w="100"/>
+              <w:right w:type="dxa" w:w="120"/>
+            </w:tcMar>
+            <w:vAlign w:val="center"/>
+          </w:tcPr>
+          <w:p>
+            <w:r>
+              <w:rPr>
+                <w:rFonts w:ascii="Consolas" w:cs="Consolas" w:eastAsia="Consolas" w:hAnsi="Consolas"/>
+                <w:b w:val="false"/>
+                <w:bCs w:val="false"/>
+                <w:color w:val="000000"/>
+                <w:sz w:val="19"/>
+                <w:szCs w:val="19"/>
+              </w:rPr>
+              <w:t xml:space="preserve">NICKNAME_TAKEN</w:t>
+            </w:r>
+          </w:p>
+        </w:tc>
+        <w:tc>
+          <w:tcPr>
+            <w:tcW w:type="dxa" w:w="2500"/>
+            <w:tcMar>
+              <w:top w:type="dxa" w:w="100"/>
+              <w:left w:type="dxa" w:w="120"/>
+              <w:bottom w:type="dxa" w:w="100"/>
+              <w:right w:type="dxa" w:w="120"/>
+            </w:tcMar>
+            <w:vAlign w:val="center"/>
+          </w:tcPr>
+          <w:p>
+            <w:r>
+              <w:rPr>
+                <w:rFonts w:ascii="Calibri" w:cs="Calibri" w:eastAsia="Calibri" w:hAnsi="Calibri"/>
+                <w:b w:val="false"/>
+                <w:bCs w:val="false"/>
+                <w:color w:val="000000"/>
+                <w:sz w:val="20"/>
+                <w:szCs w:val="20"/>
+              </w:rPr>
+              <w:t xml:space="preserve">Ese nickname ya está en uso en esta sala</w:t>
+            </w:r>
+          </w:p>
+        </w:tc>
+      </w:tr>
+    </w:tbl>
+    <w:p>
+      <w:pPr>
+        <w:spacing w:after="120"/>
+      </w:pPr>
+    </w:p>
+    <w:p>
+      <w:pPr>
+        <w:pStyle w:val="ListParagraph"/>
+        <w:numPr>
+          <w:ilvl w:val="0"/>
+          <w:numId w:val="2"/>
+        </w:numPr>
+        <w:spacing w:after="80"/>
+      </w:pPr>
+      <w:r>
+        <w:rPr>
+          <w:rFonts w:ascii="Calibri" w:cs="Calibri" w:eastAsia="Calibri" w:hAnsi="Calibri"/>
+          <w:sz w:val="22"/>
+          <w:szCs w:val="22"/>
+        </w:rPr>
+        <w:t xml:space="preserve">Antes de validar, el nickname se recorta (trim): se valida, se guarda y se devuelve ya recortado. Los espacios internos se conservan.</w:t>
+      </w:r>
+    </w:p>
+    <w:p>
+      <w:pPr>
+        <w:pStyle w:val="ListParagraph"/>
+        <w:numPr>
+          <w:ilvl w:val="0"/>
+          <w:numId w:val="2"/>
+        </w:numPr>
+        <w:spacing w:after="80"/>
+      </w:pPr>
+      <w:r>
+        <w:rPr>
+          <w:rFonts w:ascii="Calibri" w:cs="Calibri" w:eastAsia="Calibri" w:hAnsi="Calibri"/>
+          <w:sz w:val="22"/>
+          <w:szCs w:val="22"/>
+        </w:rPr>
+        <w:t xml:space="preserve">Equipo Base de Datos: Player necesita unicidad por sala sin distinguir mayúsculas. En MySQL la collation por defecto ya ignora mayúsculas, así que basta UNIQUE (roomId, nickname); en PostgreSQL hay que usar un índice único sobre (roomId, lower(nickname)).</w:t>
+      </w:r>
+    </w:p>
+    <w:p>
+      <w:pPr>
+        <w:pStyle w:val="ListParagraph"/>
+        <w:numPr>
+          <w:ilvl w:val="0"/>
+          <w:numId w:val="2"/>
+        </w:numPr>
+        <w:spacing w:after="80"/>
+      </w:pPr>
+      <w:r>
+        <w:rPr>
+          <w:rFonts w:ascii="Calibri" w:cs="Calibri" w:eastAsia="Calibri" w:hAnsi="Calibri"/>
+          <w:sz w:val="22"/>
+          <w:szCs w:val="22"/>
+        </w:rPr>
+        <w:t xml:space="preserve">Backend también captura el error de unicidad de la base de datos y responde 409 NICKNAME_TAKEN, para el caso de dos jugadores con el mismo nickname entrando a la vez.</w:t>
+      </w:r>
+    </w:p>
+    <w:p>
+      <w:pPr>
+        <w:pStyle w:val="ListParagraph"/>
+        <w:numPr>
+          <w:ilvl w:val="0"/>
+          <w:numId w:val="2"/>
+        </w:numPr>
+        <w:spacing w:after="80"/>
+      </w:pPr>
+      <w:r>
+        <w:rPr>
+          <w:rFonts w:ascii="Calibri" w:cs="Calibri" w:eastAsia="Calibri" w:hAnsi="Calibri"/>
+          <w:sz w:val="22"/>
+          <w:szCs w:val="22"/>
+        </w:rPr>
+        <w:t xml:space="preserve">La respuesta 200 no cambia (ver §3.2).</w:t>
+      </w:r>
+    </w:p>
+    <w:p>
+      <w:pPr>
+        <w:pStyle w:val="Heading2"/>
+        <w:spacing w:after="150" w:before="300"/>
+      </w:pPr>
+      <w:r>
+        <w:rPr>
+          <w:b/>
+          <w:bCs/>
+          <w:color w:val="1F4E79"/>
+          <w:sz w:val="24"/>
+          <w:szCs w:val="24"/>
+        </w:rPr>
+        <w:t xml:space="preserve">A.4 GET /api/rooms/{pin} (RF-03, reconexión)</w:t>
+      </w:r>
+    </w:p>
+    <w:p>
+      <w:pPr>
+        <w:spacing w:after="160"/>
+      </w:pPr>
+      <w:r>
+        <w:rPr>
+          <w:rFonts w:ascii="Calibri" w:cs="Calibri" w:eastAsia="Calibri" w:hAnsi="Calibri"/>
+          <w:sz w:val="22"/>
+          <w:szCs w:val="22"/>
+        </w:rPr>
+        <w:t xml:space="preserve">Respuesta 200 OK:</w:t>
+      </w:r>
+    </w:p>
+    <w:tbl>
+      <w:tblPr>
+        <w:tblW w:type="dxa" w:w="9350"/>
+      </w:tblPr>
+      <w:tblGrid>
+        <w:gridCol w:w="9350"/>
+      </w:tblGrid>
+      <w:tr>
+        <w:trPr>
+          <w:cantSplit/>
+        </w:trPr>
+        <w:tc>
+          <w:tcPr>
+            <w:tcW w:type="dxa" w:w="9350"/>
+            <w:shd w:fill="F2F2F2" w:val="clear"/>
+            <w:tcMar>
+              <w:top w:type="dxa" w:w="120"/>
+              <w:left w:type="dxa" w:w="150"/>
+              <w:bottom w:type="dxa" w:w="120"/>
+              <w:right w:type="dxa" w:w="150"/>
+            </w:tcMar>
+          </w:tcPr>
+          <w:p>
+            <w:pPr>
+              <w:spacing w:after="0"/>
+            </w:pPr>
+            <w:r>
+              <w:rPr>
+                <w:rFonts w:ascii="Consolas" w:cs="Consolas" w:eastAsia="Consolas" w:hAnsi="Consolas"/>
+                <w:sz w:val="19"/>
+                <w:szCs w:val="19"/>
+              </w:rPr>
+              <w:t xml:space="preserve">{</w:t>
+            </w:r>
+          </w:p>
+          <w:p>
+            <w:pPr>
+              <w:spacing w:after="0"/>
+            </w:pPr>
+            <w:r>
+              <w:rPr>
+                <w:rFonts w:ascii="Consolas" w:cs="Consolas" w:eastAsia="Consolas" w:hAnsi="Consolas"/>
+                <w:sz w:val="19"/>
+                <w:szCs w:val="19"/>
+              </w:rPr>
+              <w:t xml:space="preserve">  "roomId": "8f14e45f-...-b41b",</w:t>
+            </w:r>
+          </w:p>
+          <w:p>
+            <w:pPr>
+              <w:spacing w:after="0"/>
+            </w:pPr>
+            <w:r>
+              <w:rPr>
+                <w:rFonts w:ascii="Consolas" w:cs="Consolas" w:eastAsia="Consolas" w:hAnsi="Consolas"/>
+                <w:sz w:val="19"/>
+                <w:szCs w:val="19"/>
+              </w:rPr>
+              <w:t xml:space="preserve">  "pin": "048213",</w:t>
+            </w:r>
+          </w:p>
+          <w:p>
+            <w:pPr>
+              <w:spacing w:after="0"/>
+            </w:pPr>
+            <w:r>
+              <w:rPr>
+                <w:rFonts w:ascii="Consolas" w:cs="Consolas" w:eastAsia="Consolas" w:hAnsi="Consolas"/>
+                <w:sz w:val="19"/>
+                <w:szCs w:val="19"/>
+              </w:rPr>
+              <w:t xml:space="preserve">  "status": "WAITING_LOBBY",</w:t>
+            </w:r>
+          </w:p>
+          <w:p>
+            <w:pPr>
+              <w:spacing w:after="0"/>
+            </w:pPr>
+            <w:r>
+              <w:rPr>
+                <w:rFonts w:ascii="Consolas" w:cs="Consolas" w:eastAsia="Consolas" w:hAnsi="Consolas"/>
+                <w:sz w:val="19"/>
+                <w:szCs w:val="19"/>
+              </w:rPr>
+              <w:t xml:space="preserve">  "playerCount": 3</w:t>
+            </w:r>
+          </w:p>
+          <w:p>
+            <w:pPr>
+              <w:spacing w:after="0"/>
+            </w:pPr>
+            <w:r>
+              <w:rPr>
+                <w:rFonts w:ascii="Consolas" w:cs="Consolas" w:eastAsia="Consolas" w:hAnsi="Consolas"/>
+                <w:sz w:val="19"/>
+                <w:szCs w:val="19"/>
+              </w:rPr>
+              <w:t xml:space="preserve">}</w:t>
+            </w:r>
+          </w:p>
+        </w:tc>
+      </w:tr>
+    </w:tbl>
+    <w:p>
+      <w:pPr>
+        <w:spacing w:after="120"/>
+      </w:pPr>
+    </w:p>
+    <w:p>
+      <w:pPr>
+        <w:pStyle w:val="ListParagraph"/>
+        <w:numPr>
+          <w:ilvl w:val="0"/>
+          <w:numId w:val="2"/>
+        </w:numPr>
+        <w:spacing w:after="80"/>
+      </w:pPr>
+      <w:r>
+        <w:rPr>
+          <w:rFonts w:ascii="Calibri" w:cs="Calibri" w:eastAsia="Calibri" w:hAnsi="Calibri"/>
+          <w:sz w:val="22"/>
+          <w:szCs w:val="22"/>
+        </w:rPr>
+        <w:t xml:space="preserve">Errores: 400 PIN_INVALID y 404 ROOM_NOT_FOUND, con los mismos textos de A.3.</w:t>
+      </w:r>
+    </w:p>
+    <w:p>
+      <w:pPr>
+        <w:pStyle w:val="ListParagraph"/>
+        <w:numPr>
+          <w:ilvl w:val="0"/>
+          <w:numId w:val="2"/>
+        </w:numPr>
+        <w:spacing w:after="80"/>
+      </w:pPr>
+      <w:r>
+        <w:rPr>
+          <w:rFonts w:ascii="Calibri" w:cs="Calibri" w:eastAsia="Calibri" w:hAnsi="Calibri"/>
+          <w:sz w:val="22"/>
+          <w:szCs w:val="22"/>
+        </w:rPr>
+        <w:t xml:space="preserve">Es solo una consulta: no cambia el estado de la sala ni registra jugadores.</w:t>
+      </w:r>
+    </w:p>
+    <w:p>
+      <w:pPr>
+        <w:pStyle w:val="Heading2"/>
+        <w:spacing w:after="150" w:before="300"/>
+      </w:pPr>
+      <w:r>
+        <w:rPr>
+          <w:b/>
+          <w:bCs/>
+          <w:color w:val="1F4E79"/>
+          <w:sz w:val="24"/>
+          <w:szCs w:val="24"/>
+        </w:rPr>
+        <w:t xml:space="preserve">A.5 Lobby en tiempo real (/topic/room/{roomId}/lobby)</w:t>
+      </w:r>
+    </w:p>
+    <w:p>
+      <w:pPr>
+        <w:spacing w:after="160"/>
+      </w:pPr>
+      <w:r>
+        <w:rPr>
+          <w:rFonts w:ascii="Calibri" w:cs="Calibri" w:eastAsia="Calibri" w:hAnsi="Calibri"/>
+          <w:sz w:val="22"/>
+          <w:szCs w:val="22"/>
+        </w:rPr>
+        <w:t xml:space="preserve">Después de cada join exitoso, Backend publica la lista COMPLETA de jugadores (no solo el nuevo), ordenada por joinedAt de menor a mayor:</w:t>
+      </w:r>
+    </w:p>
+    <w:tbl>
+      <w:tblPr>
+        <w:tblW w:type="dxa" w:w="9350"/>
+      </w:tblPr>
+      <w:tblGrid>
+        <w:gridCol w:w="9350"/>
+      </w:tblGrid>
+      <w:tr>
+        <w:trPr>
+          <w:cantSplit/>
+        </w:trPr>
+        <w:tc>
+          <w:tcPr>
+            <w:tcW w:type="dxa" w:w="9350"/>
+            <w:shd w:fill="F2F2F2" w:val="clear"/>
+            <w:tcMar>
+              <w:top w:type="dxa" w:w="120"/>
+              <w:left w:type="dxa" w:w="150"/>
+              <w:bottom w:type="dxa" w:w="120"/>
+              <w:right w:type="dxa" w:w="150"/>
+            </w:tcMar>
+          </w:tcPr>
+          <w:p>
+            <w:pPr>
+              <w:spacing w:after="0"/>
+            </w:pPr>
+            <w:r>
+              <w:rPr>
+                <w:rFonts w:ascii="Consolas" w:cs="Consolas" w:eastAsia="Consolas" w:hAnsi="Consolas"/>
+                <w:sz w:val="19"/>
+                <w:szCs w:val="19"/>
+              </w:rPr>
+              <w:t xml:space="preserve">{</w:t>
+            </w:r>
+          </w:p>
+          <w:p>
+            <w:pPr>
+              <w:spacing w:after="0"/>
+            </w:pPr>
+            <w:r>
+              <w:rPr>
+                <w:rFonts w:ascii="Consolas" w:cs="Consolas" w:eastAsia="Consolas" w:hAnsi="Consolas"/>
+                <w:sz w:val="19"/>
+                <w:szCs w:val="19"/>
+              </w:rPr>
+              <w:t xml:space="preserve">  "roomId": "8f14e45f-...-b41b",</w:t>
+            </w:r>
+          </w:p>
+          <w:p>
+            <w:pPr>
+              <w:spacing w:after="0"/>
+            </w:pPr>
+            <w:r>
+              <w:rPr>
+                <w:rFonts w:ascii="Consolas" w:cs="Consolas" w:eastAsia="Consolas" w:hAnsi="Consolas"/>
+                <w:sz w:val="19"/>
+                <w:szCs w:val="19"/>
+              </w:rPr>
+              <w:t xml:space="preserve">  "players": [</w:t>
+            </w:r>
+          </w:p>
+          <w:p>
+            <w:pPr>
+              <w:spacing w:after="0"/>
+            </w:pPr>
+            <w:r>
+              <w:rPr>
+                <w:rFonts w:ascii="Consolas" w:cs="Consolas" w:eastAsia="Consolas" w:hAnsi="Consolas"/>
+                <w:sz w:val="19"/>
+                <w:szCs w:val="19"/>
+              </w:rPr>
+              <w:t xml:space="preserve">    {</w:t>
+            </w:r>
+          </w:p>
+          <w:p>
+            <w:pPr>
+              <w:spacing w:after="0"/>
+            </w:pPr>
+            <w:r>
+              <w:rPr>
+                <w:rFonts w:ascii="Consolas" w:cs="Consolas" w:eastAsia="Consolas" w:hAnsi="Consolas"/>
+                <w:sz w:val="19"/>
+                <w:szCs w:val="19"/>
+              </w:rPr>
+              <w:t xml:space="preserve">      "playerId": "3c9a1e2b-...-77aa",</w:t>
+            </w:r>
+          </w:p>
+          <w:p>
+            <w:pPr>
+              <w:spacing w:after="0"/>
+            </w:pPr>
+            <w:r>
+              <w:rPr>
+                <w:rFonts w:ascii="Consolas" w:cs="Consolas" w:eastAsia="Consolas" w:hAnsi="Consolas"/>
+                <w:sz w:val="19"/>
+                <w:szCs w:val="19"/>
+              </w:rPr>
+              <w:t xml:space="preserve">      "nickname": "camilo_dev",</w:t>
+            </w:r>
+          </w:p>
+          <w:p>
+            <w:pPr>
+              <w:spacing w:after="0"/>
+            </w:pPr>
+            <w:r>
+              <w:rPr>
+                <w:rFonts w:ascii="Consolas" w:cs="Consolas" w:eastAsia="Consolas" w:hAnsi="Consolas"/>
+                <w:sz w:val="19"/>
+                <w:szCs w:val="19"/>
+              </w:rPr>
+              <w:t xml:space="preserve">      "joinedAt": "2026-09-21T14:02:11Z"</w:t>
+            </w:r>
+          </w:p>
+          <w:p>
+            <w:pPr>
+              <w:spacing w:after="0"/>
+            </w:pPr>
+            <w:r>
+              <w:rPr>
+                <w:rFonts w:ascii="Consolas" w:cs="Consolas" w:eastAsia="Consolas" w:hAnsi="Consolas"/>
+                <w:sz w:val="19"/>
+                <w:szCs w:val="19"/>
+              </w:rPr>
+              <w:t xml:space="preserve">    }</w:t>
+            </w:r>
+          </w:p>
+          <w:p>
+            <w:pPr>
+              <w:spacing w:after="0"/>
+            </w:pPr>
+            <w:r>
+              <w:rPr>
+                <w:rFonts w:ascii="Consolas" w:cs="Consolas" w:eastAsia="Consolas" w:hAnsi="Consolas"/>
+                <w:sz w:val="19"/>
+                <w:szCs w:val="19"/>
+              </w:rPr>
+              <w:t xml:space="preserve">  ]</w:t>
+            </w:r>
+          </w:p>
+          <w:p>
+            <w:pPr>
+              <w:spacing w:after="0"/>
+            </w:pPr>
+            <w:r>
+              <w:rPr>
+                <w:rFonts w:ascii="Consolas" w:cs="Consolas" w:eastAsia="Consolas" w:hAnsi="Consolas"/>
+                <w:sz w:val="19"/>
+                <w:szCs w:val="19"/>
+              </w:rPr>
+              <w:t xml:space="preserve">}</w:t>
+            </w:r>
+          </w:p>
+        </w:tc>
+      </w:tr>
+    </w:tbl>
+    <w:p>
+      <w:pPr>
+        <w:spacing w:after="120"/>
+      </w:pPr>
+    </w:p>
+    <w:p>
+      <w:pPr>
+        <w:pStyle w:val="ListParagraph"/>
+        <w:numPr>
+          <w:ilvl w:val="0"/>
+          <w:numId w:val="2"/>
+        </w:numPr>
+        <w:spacing w:after="80"/>
+      </w:pPr>
+      <w:r>
+        <w:rPr>
+          <w:rFonts w:ascii="Calibri" w:cs="Calibri" w:eastAsia="Calibri" w:hAnsi="Calibri"/>
+          <w:sz w:val="22"/>
+          <w:szCs w:val="22"/>
+        </w:rPr>
+        <w:t xml:space="preserve">Como el payload siempre trae la lista completa, el cliente reemplaza la lista que muestra con la última que recibe; no la va sumando evento por evento.</w:t>
+      </w:r>
+    </w:p>
+    <w:p>
+      <w:pPr>
+        <w:pStyle w:val="Heading2"/>
+        <w:spacing w:after="150" w:before="300"/>
+      </w:pPr>
+      <w:r>
+        <w:rPr>
+          <w:b/>
+          <w:bCs/>
+          <w:color w:val="1F4E79"/>
+          <w:sz w:val="24"/>
+          <w:szCs w:val="24"/>
+        </w:rPr>
+        <w:t xml:space="preserve">A.6 Casos de concurrencia para QA</w:t>
+      </w:r>
+    </w:p>
+    <w:p>
+      <w:pPr>
+        <w:spacing w:after="160"/>
+      </w:pPr>
+      <w:r>
+        <w:rPr>
+          <w:rFonts w:ascii="Calibri" w:cs="Calibri" w:eastAsia="Calibri" w:hAnsi="Calibri"/>
+          <w:sz w:val="22"/>
+          <w:szCs w:val="22"/>
+        </w:rPr>
+        <w:t xml:space="preserve">QA asigna los códigos CP-xx en el Plan de Pruebas. Los casos que este anexo obliga a cubrir:</w:t>
+      </w:r>
+    </w:p>
+    <w:p>
+      <w:pPr>
+        <w:pStyle w:val="ListParagraph"/>
+        <w:numPr>
+          <w:ilvl w:val="0"/>
+          <w:numId w:val="2"/>
+        </w:numPr>
+        <w:spacing w:after="80"/>
+      </w:pPr>
+      <w:r>
+        <w:rPr>
+          <w:rFonts w:ascii="Calibri" w:cs="Calibri" w:eastAsia="Calibri" w:hAnsi="Calibri"/>
+          <w:sz w:val="22"/>
+          <w:szCs w:val="22"/>
+        </w:rPr>
+        <w:t xml:space="preserve">Dos POST /api/rooms al mismo tiempo: se crean dos salas con PIN distintos.</w:t>
+      </w:r>
+    </w:p>
+    <w:p>
+      <w:pPr>
+        <w:pStyle w:val="ListParagraph"/>
+        <w:numPr>
+          <w:ilvl w:val="0"/>
+          <w:numId w:val="2"/>
+        </w:numPr>
+        <w:spacing w:after="80"/>
+      </w:pPr>
+      <w:r>
+        <w:rPr>
+          <w:rFonts w:ascii="Calibri" w:cs="Calibri" w:eastAsia="Calibri" w:hAnsi="Calibri"/>
+          <w:sz w:val="22"/>
+          <w:szCs w:val="22"/>
+        </w:rPr>
+        <w:t xml:space="preserve">Dos jugadores distintos entran a la vez a la misma sala: ambos reciben 200 y el último evento del lobby contiene a los dos.</w:t>
+      </w:r>
+    </w:p>
+    <w:p>
+      <w:pPr>
+        <w:pStyle w:val="ListParagraph"/>
+        <w:numPr>
+          <w:ilvl w:val="0"/>
+          <w:numId w:val="2"/>
+        </w:numPr>
+        <w:spacing w:after="80"/>
+      </w:pPr>
+      <w:r>
+        <w:rPr>
+          <w:rFonts w:ascii="Calibri" w:cs="Calibri" w:eastAsia="Calibri" w:hAnsi="Calibri"/>
+          <w:sz w:val="22"/>
+          <w:szCs w:val="22"/>
+        </w:rPr>
+        <w:t xml:space="preserve">Dos jugadores con el mismo nickname entran a la vez: uno recibe 200 y el otro 409 NICKNAME_TAKEN.</w:t>
+      </w:r>
+    </w:p>
+    <w:p>
+      <w:pPr>
+        <w:pStyle w:val="Heading2"/>
+        <w:spacing w:after="150" w:before="300"/>
+      </w:pPr>
+      <w:r>
+        <w:rPr>
+          <w:b/>
+          <w:bCs/>
+          <w:color w:val="1F4E79"/>
+          <w:sz w:val="24"/>
+          <w:szCs w:val="24"/>
+        </w:rPr>
+        <w:t xml:space="preserve">A.7 Puntos que Backend y QA deben confirmar</w:t>
+      </w:r>
+    </w:p>
+    <w:p>
+      <w:pPr>
+        <w:pStyle w:val="ListParagraph"/>
+        <w:numPr>
+          <w:ilvl w:val="0"/>
+          <w:numId w:val="2"/>
+        </w:numPr>
+        <w:spacing w:after="80"/>
+      </w:pPr>
+      <w:r>
+        <w:rPr>
+          <w:rFonts w:ascii="Calibri" w:cs="Calibri" w:eastAsia="Calibri" w:hAnsi="Calibri"/>
+          <w:sz w:val="22"/>
+          <w:szCs w:val="22"/>
+        </w:rPr>
+        <w:t xml:space="preserve">Los valores propuestos: 20 caracteres de nickname, 5 reintentos de PIN y los textos exactos de error.</w:t>
+      </w:r>
+    </w:p>
+    <w:p>
+      <w:pPr>
+        <w:pStyle w:val="ListParagraph"/>
+        <w:numPr>
+          <w:ilvl w:val="0"/>
+          <w:numId w:val="2"/>
+        </w:numPr>
+        <w:spacing w:after="80"/>
+      </w:pPr>
+      <w:r>
+        <w:rPr>
+          <w:rFonts w:ascii="Calibri" w:cs="Calibri" w:eastAsia="Calibri" w:hAnsi="Calibri"/>
+          <w:sz w:val="22"/>
+          <w:szCs w:val="22"/>
+        </w:rPr>
+        <w:t xml:space="preserve">Reconexión de un jugador que ya estaba dentro. Propuesta: no vuelve a llamar a join; guarda su playerId en el navegador al unirse y, si se reconecta, reutiliza ese playerId y se vuelve a suscribir a los topics. Si volviera a llamar a join con el mismo nickname, recibiría NICKNAME_TAKEN.</w:t>
+      </w:r>
+    </w:p>
+    <w:p>
+      <w:pPr>
+        <w:pStyle w:val="ListParagraph"/>
+        <w:numPr>
+          <w:ilvl w:val="0"/>
+          <w:numId w:val="2"/>
+        </w:numPr>
+        <w:spacing w:after="80"/>
+      </w:pPr>
+      <w:r>
+        <w:rPr>
+          <w:rFonts w:ascii="Calibri" w:cs="Calibri" w:eastAsia="Calibri" w:hAnsi="Calibri"/>
+          <w:sz w:val="22"/>
+          <w:szCs w:val="22"/>
+        </w:rPr>
+        <w:t xml:space="preserve">Desconexión de un jugador en el lobby: este anexo no la define (el lobby solo muestra quién entró). Si se quiere quitarlo de la lista, hay que decidirlo y registrarlo en la Bitácora.</w:t>
+      </w:r>
+    </w:p>
+    <w:p>
+      <w:pPr>
+        <w:pStyle w:val="Heading1"/>
+        <w:spacing w:after="200" w:before="400"/>
+      </w:pPr>
+      <w:r>
+        <w:rPr>
+          <w:b/>
+          <w:bCs/>
+          <w:color w:val="1F4E79"/>
+          <w:sz w:val="30"/>
+          <w:szCs w:val="30"/>
+        </w:rPr>
+        <w:t xml:space="preserve">Anexo B. Reglas de las respuestas por voz (RF-07)</w:t>
+      </w:r>
+    </w:p>
+    <w:p>
+      <w:pPr>
+        <w:pBdr>
+          <w:left w:val="single" w:color="BF9000" w:sz="18"/>
+        </w:pBdr>
+        <w:shd w:fill="FFF2CC" w:val="clear"/>
+        <w:spacing w:after="200" w:before="100"/>
+      </w:pPr>
+      <w:r>
+        <w:rPr>
+          <w:rFonts w:ascii="Calibri" w:cs="Calibri" w:eastAsia="Calibri" w:hAnsi="Calibri"/>
+          <w:i/>
+          <w:iCs/>
+          <w:color w:val="594100"/>
+          <w:sz w:val="21"/>
+          <w:szCs w:val="21"/>
+        </w:rPr>
+        <w:t xml:space="preserve">⚠ Estado: PROPUESTA pendiente de aprobación de los líderes de Frontend, Backend y QA (registrada en la Bitácora). Resuelve los puntos que el Contrato dejó abiertos: el §4.4 solo dice que en VOICE el campo value es la transcripción, y el §5 pide acordar el criterio de comparación. Si alguien cambia un valor, se edita aquí. Si Frontend ya programó la mecánica de voz, debe revisar su código contra este anexo.</w:t>
+      </w:r>
+    </w:p>
+    <w:p>
+      <w:pPr>
+        <w:pStyle w:val="Heading2"/>
+        <w:spacing w:after="150" w:before="300"/>
+      </w:pPr>
+      <w:r>
+        <w:rPr>
+          <w:b/>
+          <w:bCs/>
+          <w:color w:val="1F4E79"/>
+          <w:sz w:val="24"/>
+          <w:szCs w:val="24"/>
+        </w:rPr>
+        <w:t xml:space="preserve">B.1 Idioma de reconocimiento</w:t>
+      </w:r>
+    </w:p>
+    <w:p>
+      <w:pPr>
+        <w:pStyle w:val="ListParagraph"/>
+        <w:numPr>
+          <w:ilvl w:val="0"/>
+          <w:numId w:val="2"/>
+        </w:numPr>
+        <w:spacing w:after="80"/>
+      </w:pPr>
+      <w:r>
+        <w:rPr>
+          <w:rFonts w:ascii="Calibri" w:cs="Calibri" w:eastAsia="Calibri" w:hAnsi="Calibri"/>
+          <w:sz w:val="22"/>
+          <w:szCs w:val="22"/>
+        </w:rPr>
+        <w:t xml:space="preserve">El reconocimiento usa un solo idioma para todos los jugadores: inglés de Estados Unidos (recognition.lang = "en-US").</w:t>
+      </w:r>
+    </w:p>
+    <w:p>
+      <w:pPr>
+        <w:pStyle w:val="ListParagraph"/>
+        <w:numPr>
+          <w:ilvl w:val="0"/>
+          <w:numId w:val="2"/>
+        </w:numPr>
+        <w:spacing w:after="80"/>
+      </w:pPr>
+      <w:r>
+        <w:rPr>
+          <w:rFonts w:ascii="Calibri" w:cs="Calibri" w:eastAsia="Calibri" w:hAnsi="Calibri"/>
+          <w:sz w:val="22"/>
+          <w:szCs w:val="22"/>
+        </w:rPr>
+        <w:t xml:space="preserve">Se elige esa variante porque es la que mejor soportan los navegadores móviles. La respuesta correcta (correctAnswer) se escribe con la ortografía estadounidense (color, no colour).</w:t>
+      </w:r>
+    </w:p>
+    <w:p>
+      <w:pPr>
+        <w:pStyle w:val="Heading2"/>
+        <w:spacing w:after="150" w:before="300"/>
+      </w:pPr>
+      <w:r>
+        <w:rPr>
+          <w:b/>
+          <w:bCs/>
+          <w:color w:val="1F4E79"/>
+          <w:sz w:val="24"/>
+          <w:szCs w:val="24"/>
+        </w:rPr>
+        <w:t xml:space="preserve">B.2 Cómo se captura la voz</w:t>
+      </w:r>
+    </w:p>
+    <w:p>
+      <w:pPr>
+        <w:pStyle w:val="ListParagraph"/>
+        <w:numPr>
+          <w:ilvl w:val="0"/>
+          <w:numId w:val="2"/>
+        </w:numPr>
+        <w:spacing w:after="80"/>
+      </w:pPr>
+      <w:r>
+        <w:rPr>
+          <w:rFonts w:ascii="Calibri" w:cs="Calibri" w:eastAsia="Calibri" w:hAnsi="Calibri"/>
+          <w:sz w:val="22"/>
+          <w:szCs w:val="22"/>
+        </w:rPr>
+        <w:t xml:space="preserve">El jugador toca el botón de micrófono para empezar a hablar (RF-07). Se usa reconocimiento no continuo: una frase por captura.</w:t>
+      </w:r>
+    </w:p>
+    <w:p>
+      <w:pPr>
+        <w:pStyle w:val="ListParagraph"/>
+        <w:numPr>
+          <w:ilvl w:val="0"/>
+          <w:numId w:val="2"/>
+        </w:numPr>
+        <w:spacing w:after="80"/>
+      </w:pPr>
+      <w:r>
+        <w:rPr>
+          <w:rFonts w:ascii="Calibri" w:cs="Calibri" w:eastAsia="Calibri" w:hAnsi="Calibri"/>
+          <w:sz w:val="22"/>
+          <w:szCs w:val="22"/>
+        </w:rPr>
+        <w:t xml:space="preserve">La captura termina en cuanto ocurra lo primero de esto: el jugador toca de nuevo el botón, el navegador detecta el final de la frase, o se acaba el tiempo de la pregunta.</w:t>
+      </w:r>
+    </w:p>
+    <w:p>
+      <w:pPr>
+        <w:pStyle w:val="ListParagraph"/>
+        <w:numPr>
+          <w:ilvl w:val="0"/>
+          <w:numId w:val="2"/>
+        </w:numPr>
+        <w:spacing w:after="80"/>
+      </w:pPr>
+      <w:r>
+        <w:rPr>
+          <w:rFonts w:ascii="Calibri" w:cs="Calibri" w:eastAsia="Calibri" w:hAnsi="Calibri"/>
+          <w:sz w:val="22"/>
+          <w:szCs w:val="22"/>
+        </w:rPr>
+        <w:t xml:space="preserve">Si se acaba el tiempo, la captura en curso se descarta y no se envía nada: el servidor ya cerró la pregunta.</w:t>
+      </w:r>
+    </w:p>
+    <w:p>
+      <w:pPr>
+        <w:pStyle w:val="Heading2"/>
+        <w:spacing w:after="150" w:before="300"/>
+      </w:pPr>
+      <w:r>
+        <w:rPr>
+          <w:b/>
+          <w:bCs/>
+          <w:color w:val="1F4E79"/>
+          <w:sz w:val="24"/>
+          <w:szCs w:val="24"/>
+        </w:rPr>
+        <w:t xml:space="preserve">B.3 Qué ve el jugador y qué se envía</w:t>
+      </w:r>
+    </w:p>
+    <w:p>
+      <w:pPr>
+        <w:pStyle w:val="ListParagraph"/>
+        <w:numPr>
+          <w:ilvl w:val="0"/>
+          <w:numId w:val="2"/>
+        </w:numPr>
+        <w:spacing w:after="80"/>
+      </w:pPr>
+      <w:r>
+        <w:rPr>
+          <w:rFonts w:ascii="Calibri" w:cs="Calibri" w:eastAsia="Calibri" w:hAnsi="Calibri"/>
+          <w:sz w:val="22"/>
+          <w:szCs w:val="22"/>
+        </w:rPr>
+        <w:t xml:space="preserve">Mientras habla se muestra el texto parcial en un estilo atenuado (interimResults = true), para que vea que lo están escuchando.</w:t>
+      </w:r>
+    </w:p>
+    <w:p>
+      <w:pPr>
+        <w:pStyle w:val="ListParagraph"/>
+        <w:numPr>
+          <w:ilvl w:val="0"/>
+          <w:numId w:val="2"/>
+        </w:numPr>
+        <w:spacing w:after="80"/>
+      </w:pPr>
+      <w:r>
+        <w:rPr>
+          <w:rFonts w:ascii="Calibri" w:cs="Calibri" w:eastAsia="Calibri" w:hAnsi="Calibri"/>
+          <w:sz w:val="22"/>
+          <w:szCs w:val="22"/>
+        </w:rPr>
+        <w:t xml:space="preserve">Al terminar queda la transcripción final en pantalla con dos botones: "Enviar" y "Repetir". La respuesta se envía solo al tocar "Enviar", así el jugador puede corregir una mala transcripción antes de que cuente.</w:t>
+      </w:r>
+    </w:p>
+    <w:p>
+      <w:pPr>
+        <w:pStyle w:val="ListParagraph"/>
+        <w:numPr>
+          <w:ilvl w:val="0"/>
+          <w:numId w:val="2"/>
+        </w:numPr>
+        <w:spacing w:after="80"/>
+      </w:pPr>
+      <w:r>
+        <w:rPr>
+          <w:rFonts w:ascii="Calibri" w:cs="Calibri" w:eastAsia="Calibri" w:hAnsi="Calibri"/>
+          <w:sz w:val="22"/>
+          <w:szCs w:val="22"/>
+        </w:rPr>
+        <w:t xml:space="preserve">Solo la transcripción final se envía, por /app/room/{roomId}/answer, con el formato de siempre (§4.4): value es un texto. Nunca se envían los resultados parciales.</w:t>
+      </w:r>
+    </w:p>
+    <w:p>
+      <w:pPr>
+        <w:pStyle w:val="ListParagraph"/>
+        <w:numPr>
+          <w:ilvl w:val="0"/>
+          <w:numId w:val="2"/>
+        </w:numPr>
+        <w:spacing w:after="80"/>
+      </w:pPr>
+      <w:r>
+        <w:rPr>
+          <w:rFonts w:ascii="Calibri" w:cs="Calibri" w:eastAsia="Calibri" w:hAnsi="Calibri"/>
+          <w:sz w:val="22"/>
+          <w:szCs w:val="22"/>
+        </w:rPr>
+        <w:t xml:space="preserve">El tiempo de respuesta cuenta hasta el momento del envío (el payload del §4.4 lleva clientTimestamp), por lo que "Repetir" cuesta tiempo y puntos: se dice así en la explicación de la mecánica.</w:t>
+      </w:r>
+    </w:p>
+    <w:p>
+      <w:pPr>
+        <w:pStyle w:val="Heading2"/>
+        <w:spacing w:after="150" w:before="300"/>
+      </w:pPr>
+      <w:r>
+        <w:rPr>
+          <w:b/>
+          <w:bCs/>
+          <w:color w:val="1F4E79"/>
+          <w:sz w:val="24"/>
+          <w:szCs w:val="24"/>
+        </w:rPr>
+        <w:t xml:space="preserve">B.4 Micrófono no disponible</w:t>
+      </w:r>
+    </w:p>
+    <w:p>
+      <w:pPr>
+        <w:spacing w:after="160"/>
+      </w:pPr>
+      <w:r>
+        <w:rPr>
+          <w:rFonts w:ascii="Calibri" w:cs="Calibri" w:eastAsia="Calibri" w:hAnsi="Calibri"/>
+          <w:sz w:val="22"/>
+          <w:szCs w:val="22"/>
+        </w:rPr>
+        <w:t xml:space="preserve">Hay tres causas posibles: el jugador negó el permiso (errores not-allowed o service-not-allowed), el navegador no trae la API de voz (no existe SpeechRecognition ni webkitSpeechRecognition), o falla la conexión (error network, porque el reconocimiento de Chrome necesita internet). En los tres casos se hace lo mismo:</w:t>
+      </w:r>
+    </w:p>
+    <w:p>
+      <w:pPr>
+        <w:pStyle w:val="ListParagraph"/>
+        <w:numPr>
+          <w:ilvl w:val="0"/>
+          <w:numId w:val="2"/>
+        </w:numPr>
+        <w:spacing w:after="80"/>
+      </w:pPr>
+      <w:r>
+        <w:rPr>
+          <w:rFonts w:ascii="Calibri" w:cs="Calibri" w:eastAsia="Calibri" w:hAnsi="Calibri"/>
+          <w:sz w:val="22"/>
+          <w:szCs w:val="22"/>
+        </w:rPr>
+        <w:t xml:space="preserve">Se muestra el mensaje: "No pudimos usar el micrófono. Escribe tu respuesta." Si fue por permiso negado, se añade: "Si lo bloqueaste, actívalo en los ajustes del navegador."</w:t>
+      </w:r>
+    </w:p>
+    <w:p>
+      <w:pPr>
+        <w:pStyle w:val="ListParagraph"/>
+        <w:numPr>
+          <w:ilvl w:val="0"/>
+          <w:numId w:val="2"/>
+        </w:numPr>
+        <w:spacing w:after="80"/>
+      </w:pPr>
+      <w:r>
+        <w:rPr>
+          <w:rFonts w:ascii="Calibri" w:cs="Calibri" w:eastAsia="Calibri" w:hAnsi="Calibri"/>
+          <w:sz w:val="22"/>
+          <w:szCs w:val="22"/>
+        </w:rPr>
+        <w:t xml:space="preserve">El botón de micrófono se reemplaza por un campo de texto (el mismo de la mecánica TEXT_INPUT, con el autocorrector desactivado) y un botón "Enviar".</w:t>
+      </w:r>
+    </w:p>
+    <w:p>
+      <w:pPr>
+        <w:pStyle w:val="ListParagraph"/>
+        <w:numPr>
+          <w:ilvl w:val="0"/>
+          <w:numId w:val="2"/>
+        </w:numPr>
+        <w:spacing w:after="80"/>
+      </w:pPr>
+      <w:r>
+        <w:rPr>
+          <w:rFonts w:ascii="Calibri" w:cs="Calibri" w:eastAsia="Calibri" w:hAnsi="Calibri"/>
+          <w:sz w:val="22"/>
+          <w:szCs w:val="22"/>
+        </w:rPr>
+        <w:t xml:space="preserve">La respuesta escrita se envía con el mismo formato y para la misma pregunta VOICE: value es el texto escrito. Backend la evalúa igual y otorga los mismos puntos; no hay un canal ni un tipo especial.</w:t>
+      </w:r>
+    </w:p>
+    <w:p>
+      <w:pPr>
+        <w:pStyle w:val="ListParagraph"/>
+        <w:numPr>
+          <w:ilvl w:val="0"/>
+          <w:numId w:val="2"/>
+        </w:numPr>
+        <w:spacing w:after="80"/>
+      </w:pPr>
+      <w:r>
+        <w:rPr>
+          <w:rFonts w:ascii="Calibri" w:cs="Calibri" w:eastAsia="Calibri" w:hAnsi="Calibri"/>
+          <w:sz w:val="22"/>
+          <w:szCs w:val="22"/>
+        </w:rPr>
+        <w:t xml:space="preserve">Esto concreta lo que ya dice el Checklist pre-evento ("usa el modo de texto como alterno") y evita que el jugador se quede sin poder contestar.</w:t>
+      </w:r>
+    </w:p>
+    <w:p>
+      <w:pPr>
+        <w:pStyle w:val="Heading2"/>
+        <w:spacing w:after="150" w:before="300"/>
+      </w:pPr>
+      <w:r>
+        <w:rPr>
+          <w:b/>
+          <w:bCs/>
+          <w:color w:val="1F4E79"/>
+          <w:sz w:val="24"/>
+          <w:szCs w:val="24"/>
+        </w:rPr>
+        <w:t xml:space="preserve">B.5 Silencio o sin resultado</w:t>
+      </w:r>
+    </w:p>
+    <w:p>
+      <w:pPr>
+        <w:pStyle w:val="ListParagraph"/>
+        <w:numPr>
+          <w:ilvl w:val="0"/>
+          <w:numId w:val="2"/>
+        </w:numPr>
+        <w:spacing w:after="80"/>
+      </w:pPr>
+      <w:r>
+        <w:rPr>
+          <w:rFonts w:ascii="Calibri" w:cs="Calibri" w:eastAsia="Calibri" w:hAnsi="Calibri"/>
+          <w:sz w:val="22"/>
+          <w:szCs w:val="22"/>
+        </w:rPr>
+        <w:t xml:space="preserve">Si el navegador no detecta voz (error no-speech) o la captura termina sin transcripción, no se envía nada y se muestra: "No te escuché. Toca el micrófono e inténtalo de nuevo."</w:t>
+      </w:r>
+    </w:p>
+    <w:p>
+      <w:pPr>
+        <w:pStyle w:val="ListParagraph"/>
+        <w:numPr>
+          <w:ilvl w:val="0"/>
+          <w:numId w:val="2"/>
+        </w:numPr>
+        <w:spacing w:after="80"/>
+      </w:pPr>
+      <w:r>
+        <w:rPr>
+          <w:rFonts w:ascii="Calibri" w:cs="Calibri" w:eastAsia="Calibri" w:hAnsi="Calibri"/>
+          <w:sz w:val="22"/>
+          <w:szCs w:val="22"/>
+        </w:rPr>
+        <w:t xml:space="preserve">El jugador puede reintentar sin límite mientras quede tiempo. Si se acaba el tiempo sin que haya enviado respuesta, cuenta como pregunta sin responder, igual que en las demás mecánicas.</w:t>
+      </w:r>
+    </w:p>
+    <w:p>
+      <w:pPr>
+        <w:pStyle w:val="Heading2"/>
+        <w:spacing w:after="150" w:before="300"/>
+      </w:pPr>
+      <w:r>
+        <w:rPr>
+          <w:b/>
+          <w:bCs/>
+          <w:color w:val="1F4E79"/>
+          <w:sz w:val="24"/>
+          <w:szCs w:val="24"/>
+        </w:rPr>
+        <w:t xml:space="preserve">B.6 Criterio de comparación en Backend (VOICE y TEXT_INPUT)</w:t>
+      </w:r>
+    </w:p>
+    <w:p>
+      <w:pPr>
+        <w:spacing w:after="160"/>
+      </w:pPr>
+      <w:r>
+        <w:rPr>
+          <w:rFonts w:ascii="Calibri" w:cs="Calibri" w:eastAsia="Calibri" w:hAnsi="Calibri"/>
+          <w:sz w:val="22"/>
+          <w:szCs w:val="22"/>
+        </w:rPr>
+        <w:t xml:space="preserve">Backend nunca compara el texto tal cual: normaliza value y correctAnswer con las mismas reglas y los compara por igualdad. Esto responde lo que pide el §5 y se apoya en el RF-06 ("normalización de cadenas en el servidor antes de validar"). Se aplica en este orden:</w:t>
+      </w:r>
+    </w:p>
+    <w:tbl>
+      <w:tblPr>
+        <w:tblW w:type="dxa" w:w="9350"/>
+        <w:tblBorders>
+          <w:top w:val="single" w:color="auto" w:sz="4"/>
+          <w:left w:val="single" w:color="auto" w:sz="4"/>
+          <w:bottom w:val="single" w:color="auto" w:sz="4"/>
+          <w:right w:val="single" w:color="auto" w:sz="4"/>
+          <w:insideH w:val="single" w:color="auto" w:sz="4"/>
+          <w:insideV w:val="single" w:color="auto" w:sz="4"/>
+        </w:tblBorders>
+      </w:tblPr>
+      <w:tblGrid>
+        <w:gridCol w:w="450"/>
+        <w:gridCol w:w="5300"/>
+        <w:gridCol w:w="3600"/>
+      </w:tblGrid>
+      <w:tr>
+        <w:trPr>
+          <w:tblHeader/>
+        </w:trPr>
+        <w:tc>
+          <w:tcPr>
+            <w:tcW w:type="dxa" w:w="450"/>
+            <w:shd w:fill="1F4E79" w:val="clear"/>
+            <w:tcMar>
+              <w:top w:type="dxa" w:w="100"/>
+              <w:left w:type="dxa" w:w="120"/>
+              <w:bottom w:type="dxa" w:w="100"/>
+              <w:right w:type="dxa" w:w="120"/>
+            </w:tcMar>
+            <w:vAlign w:val="center"/>
+          </w:tcPr>
+          <w:p>
+            <w:r>
+              <w:rPr>
+                <w:rFonts w:ascii="Calibri" w:cs="Calibri" w:eastAsia="Calibri" w:hAnsi="Calibri"/>
+                <w:b/>
+                <w:bCs/>
+                <w:color w:val="FFFFFF"/>
+                <w:sz w:val="20"/>
+                <w:szCs w:val="20"/>
+              </w:rPr>
+              <w:t xml:space="preserve">#</w:t>
+            </w:r>
+          </w:p>
+        </w:tc>
+        <w:tc>
+          <w:tcPr>
+            <w:tcW w:type="dxa" w:w="5300"/>
+            <w:shd w:fill="1F4E79" w:val="clear"/>
+            <w:tcMar>
+              <w:top w:type="dxa" w:w="100"/>
+              <w:left w:type="dxa" w:w="120"/>
+              <w:bottom w:type="dxa" w:w="100"/>
+              <w:right w:type="dxa" w:w="120"/>
+            </w:tcMar>
+            <w:vAlign w:val="center"/>
+          </w:tcPr>
+          <w:p>
+            <w:r>
+              <w:rPr>
+                <w:rFonts w:ascii="Calibri" w:cs="Calibri" w:eastAsia="Calibri" w:hAnsi="Calibri"/>
+                <w:b/>
+                <w:bCs/>
+                <w:color w:val="FFFFFF"/>
+                <w:sz w:val="20"/>
+                <w:szCs w:val="20"/>
+              </w:rPr>
+              <w:t xml:space="preserve">Paso de normalización</w:t>
+            </w:r>
+          </w:p>
+        </w:tc>
+        <w:tc>
+          <w:tcPr>
+            <w:tcW w:type="dxa" w:w="3600"/>
+            <w:shd w:fill="1F4E79" w:val="clear"/>
+            <w:tcMar>
+              <w:top w:type="dxa" w:w="100"/>
+              <w:left w:type="dxa" w:w="120"/>
+              <w:bottom w:type="dxa" w:w="100"/>
+              <w:right w:type="dxa" w:w="120"/>
+            </w:tcMar>
+            <w:vAlign w:val="center"/>
+          </w:tcPr>
+          <w:p>
+            <w:r>
+              <w:rPr>
+                <w:rFonts w:ascii="Calibri" w:cs="Calibri" w:eastAsia="Calibri" w:hAnsi="Calibri"/>
+                <w:b/>
+                <w:bCs/>
+                <w:color w:val="FFFFFF"/>
+                <w:sz w:val="20"/>
+                <w:szCs w:val="20"/>
+              </w:rPr>
+              <w:t xml:space="preserve">Ejemplo</w:t>
+            </w:r>
+          </w:p>
+        </w:tc>
+      </w:tr>
+      <w:tr>
+        <w:trPr>
+          <w:cantSplit/>
+        </w:trPr>
+        <w:tc>
+          <w:tcPr>
+            <w:tcW w:type="dxa" w:w="450"/>
+            <w:tcMar>
+              <w:top w:type="dxa" w:w="100"/>
+              <w:left w:type="dxa" w:w="120"/>
+              <w:bottom w:type="dxa" w:w="100"/>
+              <w:right w:type="dxa" w:w="120"/>
+            </w:tcMar>
+            <w:vAlign w:val="center"/>
+          </w:tcPr>
+          <w:p>
+            <w:r>
+              <w:rPr>
+                <w:rFonts w:ascii="Calibri" w:cs="Calibri" w:eastAsia="Calibri" w:hAnsi="Calibri"/>
+                <w:b w:val="false"/>
+                <w:bCs w:val="false"/>
+                <w:color w:val="000000"/>
+                <w:sz w:val="20"/>
+                <w:szCs w:val="20"/>
+              </w:rPr>
+              <w:t xml:space="preserve">1</w:t>
+            </w:r>
+          </w:p>
+        </w:tc>
+        <w:tc>
+          <w:tcPr>
+            <w:tcW w:type="dxa" w:w="5300"/>
+            <w:tcMar>
+              <w:top w:type="dxa" w:w="100"/>
+              <w:left w:type="dxa" w:w="120"/>
+              <w:bottom w:type="dxa" w:w="100"/>
+              <w:right w:type="dxa" w:w="120"/>
+            </w:tcMar>
+            <w:vAlign w:val="center"/>
+          </w:tcPr>
+          <w:p>
+            <w:r>
+              <w:rPr>
+                <w:rFonts w:ascii="Calibri" w:cs="Calibri" w:eastAsia="Calibri" w:hAnsi="Calibri"/>
+                <w:b w:val="false"/>
+                <w:bCs w:val="false"/>
+                <w:color w:val="000000"/>
+                <w:sz w:val="20"/>
+                <w:szCs w:val="20"/>
+              </w:rPr>
+              <w:t xml:space="preserve">Quitar espacios al inicio y al final, y reducir varios espacios seguidos a uno.</w:t>
+            </w:r>
+          </w:p>
+        </w:tc>
+        <w:tc>
+          <w:tcPr>
+            <w:tcW w:type="dxa" w:w="3600"/>
+            <w:tcMar>
+              <w:top w:type="dxa" w:w="100"/>
+              <w:left w:type="dxa" w:w="120"/>
+              <w:bottom w:type="dxa" w:w="100"/>
+              <w:right w:type="dxa" w:w="120"/>
+            </w:tcMar>
+            <w:vAlign w:val="center"/>
+          </w:tcPr>
+          <w:p>
+            <w:r>
+              <w:rPr>
+                <w:rFonts w:ascii="Calibri" w:cs="Calibri" w:eastAsia="Calibri" w:hAnsi="Calibri"/>
+                <w:b w:val="false"/>
+                <w:bCs w:val="false"/>
+                <w:color w:val="000000"/>
+                <w:sz w:val="20"/>
+                <w:szCs w:val="20"/>
+              </w:rPr>
+              <w:t xml:space="preserve">"  I  went home " → "I went home"</w:t>
+            </w:r>
+          </w:p>
+        </w:tc>
+      </w:tr>
+      <w:tr>
+        <w:trPr>
+          <w:cantSplit/>
+        </w:trPr>
+        <w:tc>
+          <w:tcPr>
+            <w:tcW w:type="dxa" w:w="450"/>
+            <w:tcMar>
+              <w:top w:type="dxa" w:w="100"/>
+              <w:left w:type="dxa" w:w="120"/>
+              <w:bottom w:type="dxa" w:w="100"/>
+              <w:right w:type="dxa" w:w="120"/>
+            </w:tcMar>
+            <w:vAlign w:val="center"/>
+          </w:tcPr>
+          <w:p>
+            <w:r>
+              <w:rPr>
+                <w:rFonts w:ascii="Calibri" w:cs="Calibri" w:eastAsia="Calibri" w:hAnsi="Calibri"/>
+                <w:b w:val="false"/>
+                <w:bCs w:val="false"/>
+                <w:color w:val="000000"/>
+                <w:sz w:val="20"/>
+                <w:szCs w:val="20"/>
+              </w:rPr>
+              <w:t xml:space="preserve">2</w:t>
+            </w:r>
+          </w:p>
+        </w:tc>
+        <w:tc>
+          <w:tcPr>
+            <w:tcW w:type="dxa" w:w="5300"/>
+            <w:tcMar>
+              <w:top w:type="dxa" w:w="100"/>
+              <w:left w:type="dxa" w:w="120"/>
+              <w:bottom w:type="dxa" w:w="100"/>
+              <w:right w:type="dxa" w:w="120"/>
+            </w:tcMar>
+            <w:vAlign w:val="center"/>
+          </w:tcPr>
+          <w:p>
+            <w:r>
+              <w:rPr>
+                <w:rFonts w:ascii="Calibri" w:cs="Calibri" w:eastAsia="Calibri" w:hAnsi="Calibri"/>
+                <w:b w:val="false"/>
+                <w:bCs w:val="false"/>
+                <w:color w:val="000000"/>
+                <w:sz w:val="20"/>
+                <w:szCs w:val="20"/>
+              </w:rPr>
+              <w:t xml:space="preserve">Pasar todo a minúsculas.</w:t>
+            </w:r>
+          </w:p>
+        </w:tc>
+        <w:tc>
+          <w:tcPr>
+            <w:tcW w:type="dxa" w:w="3600"/>
+            <w:tcMar>
+              <w:top w:type="dxa" w:w="100"/>
+              <w:left w:type="dxa" w:w="120"/>
+              <w:bottom w:type="dxa" w:w="100"/>
+              <w:right w:type="dxa" w:w="120"/>
+            </w:tcMar>
+            <w:vAlign w:val="center"/>
+          </w:tcPr>
+          <w:p>
+            <w:r>
+              <w:rPr>
+                <w:rFonts w:ascii="Calibri" w:cs="Calibri" w:eastAsia="Calibri" w:hAnsi="Calibri"/>
+                <w:b w:val="false"/>
+                <w:bCs w:val="false"/>
+                <w:color w:val="000000"/>
+                <w:sz w:val="20"/>
+                <w:szCs w:val="20"/>
+              </w:rPr>
+              <w:t xml:space="preserve">"I Went Home" → "i went home"</w:t>
+            </w:r>
+          </w:p>
+        </w:tc>
+      </w:tr>
+      <w:tr>
+        <w:trPr>
+          <w:cantSplit/>
+        </w:trPr>
+        <w:tc>
+          <w:tcPr>
+            <w:tcW w:type="dxa" w:w="450"/>
+            <w:tcMar>
+              <w:top w:type="dxa" w:w="100"/>
+              <w:left w:type="dxa" w:w="120"/>
+              <w:bottom w:type="dxa" w:w="100"/>
+              <w:right w:type="dxa" w:w="120"/>
+            </w:tcMar>
+            <w:vAlign w:val="center"/>
+          </w:tcPr>
+          <w:p>
+            <w:r>
+              <w:rPr>
+                <w:rFonts w:ascii="Calibri" w:cs="Calibri" w:eastAsia="Calibri" w:hAnsi="Calibri"/>
+                <w:b w:val="false"/>
+                <w:bCs w:val="false"/>
+                <w:color w:val="000000"/>
+                <w:sz w:val="20"/>
+                <w:szCs w:val="20"/>
+              </w:rPr>
+              <w:t xml:space="preserve">3</w:t>
+            </w:r>
+          </w:p>
+        </w:tc>
+        <w:tc>
+          <w:tcPr>
+            <w:tcW w:type="dxa" w:w="5300"/>
+            <w:tcMar>
+              <w:top w:type="dxa" w:w="100"/>
+              <w:left w:type="dxa" w:w="120"/>
+              <w:bottom w:type="dxa" w:w="100"/>
+              <w:right w:type="dxa" w:w="120"/>
+            </w:tcMar>
+            <w:vAlign w:val="center"/>
+          </w:tcPr>
+          <w:p>
+            <w:r>
+              <w:rPr>
+                <w:rFonts w:ascii="Calibri" w:cs="Calibri" w:eastAsia="Calibri" w:hAnsi="Calibri"/>
+                <w:b w:val="false"/>
+                <w:bCs w:val="false"/>
+                <w:color w:val="000000"/>
+                <w:sz w:val="20"/>
+                <w:szCs w:val="20"/>
+              </w:rPr>
+              <w:t xml:space="preserve">Quitar tildes y otros signos diacríticos.</w:t>
+            </w:r>
+          </w:p>
+        </w:tc>
+        <w:tc>
+          <w:tcPr>
+            <w:tcW w:type="dxa" w:w="3600"/>
+            <w:tcMar>
+              <w:top w:type="dxa" w:w="100"/>
+              <w:left w:type="dxa" w:w="120"/>
+              <w:bottom w:type="dxa" w:w="100"/>
+              <w:right w:type="dxa" w:w="120"/>
+            </w:tcMar>
+            <w:vAlign w:val="center"/>
+          </w:tcPr>
+          <w:p>
+            <w:r>
+              <w:rPr>
+                <w:rFonts w:ascii="Calibri" w:cs="Calibri" w:eastAsia="Calibri" w:hAnsi="Calibri"/>
+                <w:b w:val="false"/>
+                <w:bCs w:val="false"/>
+                <w:color w:val="000000"/>
+                <w:sz w:val="20"/>
+                <w:szCs w:val="20"/>
+              </w:rPr>
+              <w:t xml:space="preserve">"canción" → "cancion"</w:t>
+            </w:r>
+          </w:p>
+        </w:tc>
+      </w:tr>
+      <w:tr>
+        <w:trPr>
+          <w:cantSplit/>
+        </w:trPr>
+        <w:tc>
+          <w:tcPr>
+            <w:tcW w:type="dxa" w:w="450"/>
+            <w:tcMar>
+              <w:top w:type="dxa" w:w="100"/>
+              <w:left w:type="dxa" w:w="120"/>
+              <w:bottom w:type="dxa" w:w="100"/>
+              <w:right w:type="dxa" w:w="120"/>
+            </w:tcMar>
+            <w:vAlign w:val="center"/>
+          </w:tcPr>
+          <w:p>
+            <w:r>
+              <w:rPr>
+                <w:rFonts w:ascii="Calibri" w:cs="Calibri" w:eastAsia="Calibri" w:hAnsi="Calibri"/>
+                <w:b w:val="false"/>
+                <w:bCs w:val="false"/>
+                <w:color w:val="000000"/>
+                <w:sz w:val="20"/>
+                <w:szCs w:val="20"/>
+              </w:rPr>
+              <w:t xml:space="preserve">4</w:t>
+            </w:r>
+          </w:p>
+        </w:tc>
+        <w:tc>
+          <w:tcPr>
+            <w:tcW w:type="dxa" w:w="5300"/>
+            <w:tcMar>
+              <w:top w:type="dxa" w:w="100"/>
+              <w:left w:type="dxa" w:w="120"/>
+              <w:bottom w:type="dxa" w:w="100"/>
+              <w:right w:type="dxa" w:w="120"/>
+            </w:tcMar>
+            <w:vAlign w:val="center"/>
+          </w:tcPr>
+          <w:p>
+            <w:r>
+              <w:rPr>
+                <w:rFonts w:ascii="Calibri" w:cs="Calibri" w:eastAsia="Calibri" w:hAnsi="Calibri"/>
+                <w:b w:val="false"/>
+                <w:bCs w:val="false"/>
+                <w:color w:val="000000"/>
+                <w:sz w:val="20"/>
+                <w:szCs w:val="20"/>
+              </w:rPr>
+              <w:t xml:space="preserve">Quitar la puntuación . , ; : ! ? ¿ ¡ y las comillas dobles. Se conservan el apóstrofo y el guion.</w:t>
+            </w:r>
+          </w:p>
+        </w:tc>
+        <w:tc>
+          <w:tcPr>
+            <w:tcW w:type="dxa" w:w="3600"/>
+            <w:tcMar>
+              <w:top w:type="dxa" w:w="100"/>
+              <w:left w:type="dxa" w:w="120"/>
+              <w:bottom w:type="dxa" w:w="100"/>
+              <w:right w:type="dxa" w:w="120"/>
+            </w:tcMar>
+            <w:vAlign w:val="center"/>
+          </w:tcPr>
+          <w:p>
+            <w:r>
+              <w:rPr>
+                <w:rFonts w:ascii="Calibri" w:cs="Calibri" w:eastAsia="Calibri" w:hAnsi="Calibri"/>
+                <w:b w:val="false"/>
+                <w:bCs w:val="false"/>
+                <w:color w:val="000000"/>
+                <w:sz w:val="20"/>
+                <w:szCs w:val="20"/>
+              </w:rPr>
+              <w:t xml:space="preserve">"I don't know." → "i don't know"</w:t>
+            </w:r>
+          </w:p>
+        </w:tc>
+      </w:tr>
+    </w:tbl>
+    <w:p>
+      <w:pPr>
+        <w:spacing w:after="120"/>
+      </w:pPr>
+    </w:p>
+    <w:p>
+      <w:pPr>
+        <w:pStyle w:val="ListParagraph"/>
+        <w:numPr>
+          <w:ilvl w:val="0"/>
+          <w:numId w:val="2"/>
+        </w:numPr>
+        <w:spacing w:after="80"/>
+      </w:pPr>
+      <w:r>
+        <w:rPr>
+          <w:rFonts w:ascii="Calibri" w:cs="Calibri" w:eastAsia="Calibri" w:hAnsi="Calibri"/>
+          <w:sz w:val="22"/>
+          <w:szCs w:val="22"/>
+        </w:rPr>
+        <w:t xml:space="preserve">Después de normalizar, la comparación es de igualdad exacta: no se toleran palabras distintas ni faltas de ortografía. Lo que se tolera es solo mayúsculas, tildes, espacios y puntuación.</w:t>
+      </w:r>
+    </w:p>
+    <w:p>
+      <w:pPr>
+        <w:pStyle w:val="ListParagraph"/>
+        <w:numPr>
+          <w:ilvl w:val="0"/>
+          <w:numId w:val="2"/>
+        </w:numPr>
+        <w:spacing w:after="80"/>
+      </w:pPr>
+      <w:r>
+        <w:rPr>
+          <w:rFonts w:ascii="Calibri" w:cs="Calibri" w:eastAsia="Calibri" w:hAnsi="Calibri"/>
+          <w:sz w:val="22"/>
+          <w:szCs w:val="22"/>
+        </w:rPr>
+        <w:t xml:space="preserve">Se conserva el apóstrofo porque la API devuelve contracciones como "don't"; se conserva el guion para no confundir "well-known" con dos palabras.</w:t>
+      </w:r>
+    </w:p>
+    <w:p>
+      <w:pPr>
+        <w:spacing w:after="160"/>
+      </w:pPr>
+      <w:r>
+        <w:rPr>
+          <w:rFonts w:ascii="Calibri" w:cs="Calibri" w:eastAsia="Calibri" w:hAnsi="Calibri"/>
+          <w:sz w:val="22"/>
+          <w:szCs w:val="22"/>
+        </w:rPr>
+        <w:t xml:space="preserve">Regla para QA al escribir preguntas VOICE (Backlog de QA, tarea 1):</w:t>
+      </w:r>
+    </w:p>
+    <w:p>
+      <w:pPr>
+        <w:pStyle w:val="ListParagraph"/>
+        <w:numPr>
+          <w:ilvl w:val="0"/>
+          <w:numId w:val="2"/>
+        </w:numPr>
+        <w:spacing w:after="80"/>
+      </w:pPr>
+      <w:r>
+        <w:rPr>
+          <w:rFonts w:ascii="Calibri" w:cs="Calibri" w:eastAsia="Calibri" w:hAnsi="Calibri"/>
+          <w:sz w:val="22"/>
+          <w:szCs w:val="22"/>
+        </w:rPr>
+        <w:t xml:space="preserve">Redactar correctAnswer sin números ni palabras que suenan igual a otras (two/to/too, there/their), porque la API puede transcribir "2" en lugar de "two".</w:t>
+      </w:r>
+    </w:p>
+    <w:p>
+      <w:pPr>
+        <w:pStyle w:val="ListParagraph"/>
+        <w:numPr>
+          <w:ilvl w:val="0"/>
+          <w:numId w:val="2"/>
+        </w:numPr>
+        <w:spacing w:after="80"/>
+      </w:pPr>
+      <w:r>
+        <w:rPr>
+          <w:rFonts w:ascii="Calibri" w:cs="Calibri" w:eastAsia="Calibri" w:hAnsi="Calibri"/>
+          <w:sz w:val="22"/>
+          <w:szCs w:val="22"/>
+        </w:rPr>
+        <w:t xml:space="preserve">Probar cada respuesta con la API real, hablándola en un teléfono, antes de cargarla al banco de preguntas. Si la API la transcribe distinto, se cambia la pregunta, no el criterio de comparación.</w:t>
+      </w:r>
+    </w:p>
+    <w:p>
+      <w:pPr>
+        <w:pStyle w:val="ListParagraph"/>
+        <w:numPr>
+          <w:ilvl w:val="0"/>
+          <w:numId w:val="2"/>
+        </w:numPr>
+        <w:spacing w:after="80"/>
+      </w:pPr>
+      <w:r>
+        <w:rPr>
+          <w:rFonts w:ascii="Calibri" w:cs="Calibri" w:eastAsia="Calibri" w:hAnsi="Calibri"/>
+          <w:sz w:val="22"/>
+          <w:szCs w:val="22"/>
+        </w:rPr>
+        <w:t xml:space="preserve">correctAnswer es un solo texto (§2.2): no se admiten respuestas alternativas.</w:t>
+      </w:r>
+    </w:p>
+    <w:p>
+      <w:pPr>
+        <w:pStyle w:val="Heading2"/>
+        <w:spacing w:after="150" w:before="300"/>
+      </w:pPr>
+      <w:r>
+        <w:rPr>
+          <w:b/>
+          <w:bCs/>
+          <w:color w:val="1F4E79"/>
+          <w:sz w:val="24"/>
+          <w:szCs w:val="24"/>
+        </w:rPr>
+        <w:t xml:space="preserve">B.7 Puntos que Frontend, Backend y QA deben confirmar</w:t>
+      </w:r>
+    </w:p>
+    <w:p>
+      <w:pPr>
+        <w:pStyle w:val="ListParagraph"/>
+        <w:numPr>
+          <w:ilvl w:val="0"/>
+          <w:numId w:val="2"/>
+        </w:numPr>
+        <w:spacing w:after="80"/>
+      </w:pPr>
+      <w:r>
+        <w:rPr>
+          <w:rFonts w:ascii="Calibri" w:cs="Calibri" w:eastAsia="Calibri" w:hAnsi="Calibri"/>
+          <w:sz w:val="22"/>
+          <w:szCs w:val="22"/>
+        </w:rPr>
+        <w:t xml:space="preserve">Envío con confirmación ("Enviar" y "Repetir") en lugar de envío automático al terminar de hablar. El envío automático es más rápido, pero no permite corregir una mala transcripción.</w:t>
+      </w:r>
+    </w:p>
+    <w:p>
+      <w:pPr>
+        <w:pStyle w:val="ListParagraph"/>
+        <w:numPr>
+          <w:ilvl w:val="0"/>
+          <w:numId w:val="2"/>
+        </w:numPr>
+        <w:spacing w:after="80"/>
+      </w:pPr>
+      <w:r>
+        <w:rPr>
+          <w:rFonts w:ascii="Calibri" w:cs="Calibri" w:eastAsia="Calibri" w:hAnsi="Calibri"/>
+          <w:sz w:val="22"/>
+          <w:szCs w:val="22"/>
+        </w:rPr>
+        <w:t xml:space="preserve">Inglés de Estados Unidos como único idioma de reconocimiento.</w:t>
+      </w:r>
+    </w:p>
+    <w:p>
+      <w:pPr>
+        <w:pStyle w:val="ListParagraph"/>
+        <w:numPr>
+          <w:ilvl w:val="0"/>
+          <w:numId w:val="2"/>
+        </w:numPr>
+        <w:spacing w:after="80"/>
+      </w:pPr>
+      <w:r>
+        <w:rPr>
+          <w:rFonts w:ascii="Calibri" w:cs="Calibri" w:eastAsia="Calibri" w:hAnsi="Calibri"/>
+          <w:sz w:val="22"/>
+          <w:szCs w:val="22"/>
+        </w:rPr>
+        <w:t xml:space="preserve">Que quien contesta por escrito porque falló el micrófono reciba los mismos puntos que quien contesta por voz.</w:t>
+      </w:r>
+    </w:p>
+    <w:p>
+      <w:pPr>
+        <w:pStyle w:val="ListParagraph"/>
+        <w:numPr>
+          <w:ilvl w:val="0"/>
+          <w:numId w:val="2"/>
+        </w:numPr>
+        <w:spacing w:after="80"/>
+      </w:pPr>
+      <w:r>
+        <w:rPr>
+          <w:rFonts w:ascii="Calibri" w:cs="Calibri" w:eastAsia="Calibri" w:hAnsi="Calibri"/>
+          <w:sz w:val="22"/>
+          <w:szCs w:val="22"/>
+        </w:rPr>
+        <w:t xml:space="preserve">Los pasos de normalización de B.6, en especial conservar el apóstrofo y el guion.</w:t>
       </w:r>
     </w:p>
     <w:sectPr>

</xml_diff>